<commit_message>
added new folks/subs to the roster
</commit_message>
<xml_diff>
--- a/public/docs/Bottoms Up 2026 League Info and Rules (03-29-26).docx
+++ b/public/docs/Bottoms Up 2026 League Info and Rules (03-29-26).docx
@@ -4322,6 +4322,560 @@
               </w:rPr>
               <w:t>TBD</w:t>
             </w:r>
+          </w:p>
+        </w:tc>
+      </w:tr>
+      <w:tr>
+        <w:trPr>
+          <w:trHeight w:val="300"/>
+        </w:trPr>
+        <w:tc>
+          <w:tcPr>
+            <w:tcW w:w="625" w:type="dxa"/>
+            <w:vAlign w:val="center"/>
+          </w:tcPr>
+          <w:p>
+            <w:pPr>
+              <w:spacing w:after="0" w:line="240" w:lineRule="auto"/>
+              <w:jc w:val="center"/>
+              <w:rPr>
+                <w:rFonts w:ascii="Calibri" w:eastAsia="Times New Roman" w:hAnsi="Calibri" w:cs="Calibri"/>
+                <w:color w:val="000000"/>
+                <w:kern w:val="0"/>
+                <w14:ligatures w14:val="none"/>
+              </w:rPr>
+            </w:pPr>
+          </w:p>
+        </w:tc>
+        <w:tc>
+          <w:tcPr>
+            <w:tcW w:w="1435" w:type="dxa"/>
+            <w:vAlign w:val="center"/>
+          </w:tcPr>
+          <w:p>
+            <w:pPr>
+              <w:spacing w:after="0" w:line="240" w:lineRule="auto"/>
+              <w:rPr>
+                <w:rFonts w:ascii="Calibri" w:eastAsia="Times New Roman" w:hAnsi="Calibri" w:cs="Calibri"/>
+                <w:color w:val="000000"/>
+                <w:kern w:val="0"/>
+                <w14:ligatures w14:val="none"/>
+              </w:rPr>
+            </w:pPr>
+            <w:r>
+              <w:rPr>
+                <w:rFonts w:ascii="Calibri" w:eastAsia="Times New Roman" w:hAnsi="Calibri" w:cs="Calibri"/>
+                <w:color w:val="000000"/>
+                <w:kern w:val="0"/>
+                <w14:ligatures w14:val="none"/>
+              </w:rPr>
+              <w:t>Ra</w:t>
+            </w:r>
+          </w:p>
+        </w:tc>
+        <w:tc>
+          <w:tcPr>
+            <w:tcW w:w="1360" w:type="dxa"/>
+            <w:vAlign w:val="center"/>
+          </w:tcPr>
+          <w:p>
+            <w:pPr>
+              <w:spacing w:after="0" w:line="240" w:lineRule="auto"/>
+              <w:rPr>
+                <w:rFonts w:ascii="Calibri" w:eastAsia="Times New Roman" w:hAnsi="Calibri" w:cs="Calibri"/>
+                <w:color w:val="000000"/>
+                <w:kern w:val="0"/>
+                <w14:ligatures w14:val="none"/>
+              </w:rPr>
+            </w:pPr>
+            <w:r>
+              <w:rPr>
+                <w:rFonts w:ascii="Calibri" w:eastAsia="Times New Roman" w:hAnsi="Calibri" w:cs="Calibri"/>
+                <w:color w:val="000000"/>
+                <w:kern w:val="0"/>
+                <w14:ligatures w14:val="none"/>
+              </w:rPr>
+              <w:t>John</w:t>
+            </w:r>
+          </w:p>
+        </w:tc>
+        <w:tc>
+          <w:tcPr>
+            <w:tcW w:w="1525" w:type="dxa"/>
+          </w:tcPr>
+          <w:p>
+            <w:pPr>
+              <w:spacing w:after="0" w:line="240" w:lineRule="auto"/>
+              <w:jc w:val="center"/>
+              <w:rPr>
+                <w:rFonts w:ascii="Calibri" w:eastAsia="Times New Roman" w:hAnsi="Calibri" w:cs="Calibri"/>
+                <w:color w:val="000000"/>
+                <w:kern w:val="0"/>
+                <w14:ligatures w14:val="none"/>
+              </w:rPr>
+            </w:pPr>
+          </w:p>
+        </w:tc>
+      </w:tr>
+      <w:tr>
+        <w:trPr>
+          <w:trHeight w:val="300"/>
+        </w:trPr>
+        <w:tc>
+          <w:tcPr>
+            <w:tcW w:w="625" w:type="dxa"/>
+            <w:vAlign w:val="center"/>
+          </w:tcPr>
+          <w:p>
+            <w:pPr>
+              <w:spacing w:after="0" w:line="240" w:lineRule="auto"/>
+              <w:jc w:val="center"/>
+              <w:rPr>
+                <w:rFonts w:ascii="Calibri" w:eastAsia="Times New Roman" w:hAnsi="Calibri" w:cs="Calibri"/>
+                <w:color w:val="000000"/>
+                <w:kern w:val="0"/>
+                <w14:ligatures w14:val="none"/>
+              </w:rPr>
+            </w:pPr>
+          </w:p>
+        </w:tc>
+        <w:tc>
+          <w:tcPr>
+            <w:tcW w:w="1435" w:type="dxa"/>
+            <w:vAlign w:val="center"/>
+          </w:tcPr>
+          <w:p>
+            <w:pPr>
+              <w:spacing w:after="0" w:line="240" w:lineRule="auto"/>
+              <w:rPr>
+                <w:rFonts w:ascii="Calibri" w:eastAsia="Times New Roman" w:hAnsi="Calibri" w:cs="Calibri"/>
+                <w:color w:val="000000"/>
+                <w:kern w:val="0"/>
+                <w14:ligatures w14:val="none"/>
+              </w:rPr>
+            </w:pPr>
+            <w:r>
+              <w:rPr>
+                <w:rFonts w:ascii="Calibri" w:eastAsia="Times New Roman" w:hAnsi="Calibri" w:cs="Calibri"/>
+                <w:color w:val="000000"/>
+                <w:kern w:val="0"/>
+                <w14:ligatures w14:val="none"/>
+              </w:rPr>
+              <w:t>Weaver</w:t>
+            </w:r>
+          </w:p>
+        </w:tc>
+        <w:tc>
+          <w:tcPr>
+            <w:tcW w:w="1360" w:type="dxa"/>
+            <w:vAlign w:val="center"/>
+          </w:tcPr>
+          <w:p>
+            <w:pPr>
+              <w:spacing w:after="0" w:line="240" w:lineRule="auto"/>
+              <w:rPr>
+                <w:rFonts w:ascii="Calibri" w:eastAsia="Times New Roman" w:hAnsi="Calibri" w:cs="Calibri"/>
+                <w:color w:val="000000"/>
+                <w:kern w:val="0"/>
+                <w14:ligatures w14:val="none"/>
+              </w:rPr>
+            </w:pPr>
+            <w:r>
+              <w:rPr>
+                <w:rFonts w:ascii="Calibri" w:eastAsia="Times New Roman" w:hAnsi="Calibri" w:cs="Calibri"/>
+                <w:color w:val="000000"/>
+                <w:kern w:val="0"/>
+                <w14:ligatures w14:val="none"/>
+              </w:rPr>
+              <w:t>John</w:t>
+            </w:r>
+          </w:p>
+        </w:tc>
+        <w:tc>
+          <w:tcPr>
+            <w:tcW w:w="1525" w:type="dxa"/>
+          </w:tcPr>
+          <w:p>
+            <w:pPr>
+              <w:spacing w:after="0" w:line="240" w:lineRule="auto"/>
+              <w:jc w:val="center"/>
+              <w:rPr>
+                <w:rFonts w:ascii="Calibri" w:eastAsia="Times New Roman" w:hAnsi="Calibri" w:cs="Calibri"/>
+                <w:color w:val="000000"/>
+                <w:kern w:val="0"/>
+                <w14:ligatures w14:val="none"/>
+              </w:rPr>
+            </w:pPr>
+          </w:p>
+        </w:tc>
+      </w:tr>
+      <w:tr>
+        <w:trPr>
+          <w:trHeight w:val="300"/>
+        </w:trPr>
+        <w:tc>
+          <w:tcPr>
+            <w:tcW w:w="625" w:type="dxa"/>
+            <w:vAlign w:val="center"/>
+          </w:tcPr>
+          <w:p>
+            <w:pPr>
+              <w:spacing w:after="0" w:line="240" w:lineRule="auto"/>
+              <w:jc w:val="center"/>
+              <w:rPr>
+                <w:rFonts w:ascii="Calibri" w:eastAsia="Times New Roman" w:hAnsi="Calibri" w:cs="Calibri"/>
+                <w:color w:val="000000"/>
+                <w:kern w:val="0"/>
+                <w14:ligatures w14:val="none"/>
+              </w:rPr>
+            </w:pPr>
+          </w:p>
+        </w:tc>
+        <w:tc>
+          <w:tcPr>
+            <w:tcW w:w="1435" w:type="dxa"/>
+            <w:vAlign w:val="center"/>
+          </w:tcPr>
+          <w:p>
+            <w:pPr>
+              <w:spacing w:after="0" w:line="240" w:lineRule="auto"/>
+              <w:rPr>
+                <w:rFonts w:ascii="Calibri" w:eastAsia="Times New Roman" w:hAnsi="Calibri" w:cs="Calibri"/>
+                <w:color w:val="000000"/>
+                <w:kern w:val="0"/>
+                <w14:ligatures w14:val="none"/>
+              </w:rPr>
+            </w:pPr>
+            <w:r>
+              <w:rPr>
+                <w:rFonts w:ascii="Calibri" w:eastAsia="Times New Roman" w:hAnsi="Calibri" w:cs="Calibri"/>
+                <w:color w:val="000000"/>
+                <w:kern w:val="0"/>
+                <w14:ligatures w14:val="none"/>
+              </w:rPr>
+              <w:t>Dvorak</w:t>
+            </w:r>
+          </w:p>
+        </w:tc>
+        <w:tc>
+          <w:tcPr>
+            <w:tcW w:w="1360" w:type="dxa"/>
+            <w:vAlign w:val="center"/>
+          </w:tcPr>
+          <w:p>
+            <w:pPr>
+              <w:spacing w:after="0" w:line="240" w:lineRule="auto"/>
+              <w:rPr>
+                <w:rFonts w:ascii="Calibri" w:eastAsia="Times New Roman" w:hAnsi="Calibri" w:cs="Calibri"/>
+                <w:color w:val="000000"/>
+                <w:kern w:val="0"/>
+                <w14:ligatures w14:val="none"/>
+              </w:rPr>
+            </w:pPr>
+            <w:r>
+              <w:rPr>
+                <w:rFonts w:ascii="Calibri" w:eastAsia="Times New Roman" w:hAnsi="Calibri" w:cs="Calibri"/>
+                <w:color w:val="000000"/>
+                <w:kern w:val="0"/>
+                <w14:ligatures w14:val="none"/>
+              </w:rPr>
+              <w:t>Perry</w:t>
+            </w:r>
+          </w:p>
+        </w:tc>
+        <w:tc>
+          <w:tcPr>
+            <w:tcW w:w="1525" w:type="dxa"/>
+          </w:tcPr>
+          <w:p>
+            <w:pPr>
+              <w:spacing w:after="0" w:line="240" w:lineRule="auto"/>
+              <w:jc w:val="center"/>
+              <w:rPr>
+                <w:rFonts w:ascii="Calibri" w:eastAsia="Times New Roman" w:hAnsi="Calibri" w:cs="Calibri"/>
+                <w:color w:val="000000"/>
+                <w:kern w:val="0"/>
+                <w14:ligatures w14:val="none"/>
+              </w:rPr>
+            </w:pPr>
+          </w:p>
+        </w:tc>
+      </w:tr>
+      <w:tr>
+        <w:trPr>
+          <w:trHeight w:val="300"/>
+        </w:trPr>
+        <w:tc>
+          <w:tcPr>
+            <w:tcW w:w="625" w:type="dxa"/>
+            <w:vAlign w:val="center"/>
+          </w:tcPr>
+          <w:p>
+            <w:pPr>
+              <w:spacing w:after="0" w:line="240" w:lineRule="auto"/>
+              <w:jc w:val="center"/>
+              <w:rPr>
+                <w:rFonts w:ascii="Calibri" w:eastAsia="Times New Roman" w:hAnsi="Calibri" w:cs="Calibri"/>
+                <w:color w:val="000000"/>
+                <w:kern w:val="0"/>
+                <w14:ligatures w14:val="none"/>
+              </w:rPr>
+            </w:pPr>
+          </w:p>
+        </w:tc>
+        <w:tc>
+          <w:tcPr>
+            <w:tcW w:w="1435" w:type="dxa"/>
+            <w:vAlign w:val="center"/>
+          </w:tcPr>
+          <w:p>
+            <w:pPr>
+              <w:spacing w:after="0" w:line="240" w:lineRule="auto"/>
+              <w:rPr>
+                <w:rFonts w:ascii="Calibri" w:eastAsia="Times New Roman" w:hAnsi="Calibri" w:cs="Calibri"/>
+                <w:color w:val="000000"/>
+                <w:kern w:val="0"/>
+                <w14:ligatures w14:val="none"/>
+              </w:rPr>
+            </w:pPr>
+            <w:proofErr w:type="spellStart"/>
+            <w:r>
+              <w:rPr>
+                <w:rFonts w:ascii="Calibri" w:eastAsia="Times New Roman" w:hAnsi="Calibri" w:cs="Calibri"/>
+                <w:color w:val="000000"/>
+                <w:kern w:val="0"/>
+                <w14:ligatures w14:val="none"/>
+              </w:rPr>
+              <w:t>Northamer</w:t>
+            </w:r>
+            <w:proofErr w:type="spellEnd"/>
+          </w:p>
+        </w:tc>
+        <w:tc>
+          <w:tcPr>
+            <w:tcW w:w="1360" w:type="dxa"/>
+            <w:vAlign w:val="center"/>
+          </w:tcPr>
+          <w:p>
+            <w:pPr>
+              <w:spacing w:after="0" w:line="240" w:lineRule="auto"/>
+              <w:rPr>
+                <w:rFonts w:ascii="Calibri" w:eastAsia="Times New Roman" w:hAnsi="Calibri" w:cs="Calibri"/>
+                <w:color w:val="000000"/>
+                <w:kern w:val="0"/>
+                <w14:ligatures w14:val="none"/>
+              </w:rPr>
+            </w:pPr>
+            <w:r>
+              <w:rPr>
+                <w:rFonts w:ascii="Calibri" w:eastAsia="Times New Roman" w:hAnsi="Calibri" w:cs="Calibri"/>
+                <w:color w:val="000000"/>
+                <w:kern w:val="0"/>
+                <w14:ligatures w14:val="none"/>
+              </w:rPr>
+              <w:t>Jim</w:t>
+            </w:r>
+          </w:p>
+        </w:tc>
+        <w:tc>
+          <w:tcPr>
+            <w:tcW w:w="1525" w:type="dxa"/>
+          </w:tcPr>
+          <w:p>
+            <w:pPr>
+              <w:spacing w:after="0" w:line="240" w:lineRule="auto"/>
+              <w:jc w:val="center"/>
+              <w:rPr>
+                <w:rFonts w:ascii="Calibri" w:eastAsia="Times New Roman" w:hAnsi="Calibri" w:cs="Calibri"/>
+                <w:color w:val="000000"/>
+                <w:kern w:val="0"/>
+                <w14:ligatures w14:val="none"/>
+              </w:rPr>
+            </w:pPr>
+          </w:p>
+        </w:tc>
+      </w:tr>
+      <w:tr>
+        <w:trPr>
+          <w:trHeight w:val="300"/>
+        </w:trPr>
+        <w:tc>
+          <w:tcPr>
+            <w:tcW w:w="625" w:type="dxa"/>
+            <w:vAlign w:val="center"/>
+          </w:tcPr>
+          <w:p>
+            <w:pPr>
+              <w:spacing w:after="0" w:line="240" w:lineRule="auto"/>
+              <w:jc w:val="center"/>
+              <w:rPr>
+                <w:rFonts w:ascii="Calibri" w:eastAsia="Times New Roman" w:hAnsi="Calibri" w:cs="Calibri"/>
+                <w:color w:val="000000"/>
+                <w:kern w:val="0"/>
+                <w14:ligatures w14:val="none"/>
+              </w:rPr>
+            </w:pPr>
+          </w:p>
+        </w:tc>
+        <w:tc>
+          <w:tcPr>
+            <w:tcW w:w="1435" w:type="dxa"/>
+            <w:vAlign w:val="center"/>
+          </w:tcPr>
+          <w:p>
+            <w:pPr>
+              <w:spacing w:after="0" w:line="240" w:lineRule="auto"/>
+              <w:rPr>
+                <w:rFonts w:ascii="Calibri" w:eastAsia="Times New Roman" w:hAnsi="Calibri" w:cs="Calibri"/>
+                <w:color w:val="000000"/>
+                <w:kern w:val="0"/>
+                <w14:ligatures w14:val="none"/>
+              </w:rPr>
+            </w:pPr>
+            <w:r>
+              <w:rPr>
+                <w:rFonts w:ascii="Calibri" w:eastAsia="Times New Roman" w:hAnsi="Calibri" w:cs="Calibri"/>
+                <w:color w:val="000000"/>
+                <w:kern w:val="0"/>
+                <w14:ligatures w14:val="none"/>
+              </w:rPr>
+              <w:t>Pineda</w:t>
+            </w:r>
+          </w:p>
+        </w:tc>
+        <w:tc>
+          <w:tcPr>
+            <w:tcW w:w="1360" w:type="dxa"/>
+            <w:vAlign w:val="center"/>
+          </w:tcPr>
+          <w:p>
+            <w:pPr>
+              <w:spacing w:after="0" w:line="240" w:lineRule="auto"/>
+              <w:rPr>
+                <w:rFonts w:ascii="Calibri" w:eastAsia="Times New Roman" w:hAnsi="Calibri" w:cs="Calibri"/>
+                <w:color w:val="000000"/>
+                <w:kern w:val="0"/>
+                <w14:ligatures w14:val="none"/>
+              </w:rPr>
+            </w:pPr>
+            <w:r>
+              <w:rPr>
+                <w:rFonts w:ascii="Calibri" w:eastAsia="Times New Roman" w:hAnsi="Calibri" w:cs="Calibri"/>
+                <w:color w:val="000000"/>
+                <w:kern w:val="0"/>
+                <w14:ligatures w14:val="none"/>
+              </w:rPr>
+              <w:t>Mario</w:t>
+            </w:r>
+          </w:p>
+        </w:tc>
+        <w:tc>
+          <w:tcPr>
+            <w:tcW w:w="1525" w:type="dxa"/>
+          </w:tcPr>
+          <w:p>
+            <w:pPr>
+              <w:spacing w:after="0" w:line="240" w:lineRule="auto"/>
+              <w:jc w:val="center"/>
+              <w:rPr>
+                <w:rFonts w:ascii="Calibri" w:eastAsia="Times New Roman" w:hAnsi="Calibri" w:cs="Calibri"/>
+                <w:color w:val="000000"/>
+                <w:kern w:val="0"/>
+                <w14:ligatures w14:val="none"/>
+              </w:rPr>
+            </w:pPr>
+          </w:p>
+        </w:tc>
+      </w:tr>
+      <w:tr>
+        <w:trPr>
+          <w:trHeight w:val="300"/>
+        </w:trPr>
+        <w:tc>
+          <w:tcPr>
+            <w:tcW w:w="625" w:type="dxa"/>
+            <w:vAlign w:val="center"/>
+          </w:tcPr>
+          <w:p>
+            <w:pPr>
+              <w:spacing w:after="0" w:line="240" w:lineRule="auto"/>
+              <w:jc w:val="center"/>
+              <w:rPr>
+                <w:rFonts w:ascii="Calibri" w:eastAsia="Times New Roman" w:hAnsi="Calibri" w:cs="Calibri"/>
+                <w:color w:val="000000"/>
+                <w:kern w:val="0"/>
+                <w14:ligatures w14:val="none"/>
+              </w:rPr>
+            </w:pPr>
+          </w:p>
+        </w:tc>
+        <w:tc>
+          <w:tcPr>
+            <w:tcW w:w="1435" w:type="dxa"/>
+            <w:vAlign w:val="center"/>
+          </w:tcPr>
+          <w:p>
+            <w:pPr>
+              <w:spacing w:after="0" w:line="240" w:lineRule="auto"/>
+              <w:rPr>
+                <w:rFonts w:ascii="Calibri" w:eastAsia="Times New Roman" w:hAnsi="Calibri" w:cs="Calibri"/>
+                <w:color w:val="000000"/>
+                <w:kern w:val="0"/>
+                <w14:ligatures w14:val="none"/>
+              </w:rPr>
+            </w:pPr>
+            <w:r>
+              <w:rPr>
+                <w:rFonts w:ascii="Calibri" w:eastAsia="Times New Roman" w:hAnsi="Calibri" w:cs="Calibri"/>
+                <w:color w:val="000000"/>
+                <w:kern w:val="0"/>
+                <w14:ligatures w14:val="none"/>
+              </w:rPr>
+              <w:t>Walters</w:t>
+            </w:r>
+          </w:p>
+        </w:tc>
+        <w:tc>
+          <w:tcPr>
+            <w:tcW w:w="1360" w:type="dxa"/>
+            <w:vAlign w:val="center"/>
+          </w:tcPr>
+          <w:p>
+            <w:pPr>
+              <w:spacing w:after="0" w:line="240" w:lineRule="auto"/>
+              <w:rPr>
+                <w:rFonts w:ascii="Calibri" w:eastAsia="Times New Roman" w:hAnsi="Calibri" w:cs="Calibri"/>
+                <w:color w:val="000000"/>
+                <w:kern w:val="0"/>
+                <w14:ligatures w14:val="none"/>
+              </w:rPr>
+            </w:pPr>
+            <w:r>
+              <w:rPr>
+                <w:rFonts w:ascii="Calibri" w:eastAsia="Times New Roman" w:hAnsi="Calibri" w:cs="Calibri"/>
+                <w:color w:val="000000"/>
+                <w:kern w:val="0"/>
+                <w14:ligatures w14:val="none"/>
+              </w:rPr>
+              <w:t>M</w:t>
+            </w:r>
+          </w:p>
+        </w:tc>
+        <w:tc>
+          <w:tcPr>
+            <w:tcW w:w="1525" w:type="dxa"/>
+          </w:tcPr>
+          <w:p>
+            <w:pPr>
+              <w:spacing w:after="0" w:line="240" w:lineRule="auto"/>
+              <w:jc w:val="center"/>
+              <w:rPr>
+                <w:rFonts w:ascii="Calibri" w:eastAsia="Times New Roman" w:hAnsi="Calibri" w:cs="Calibri"/>
+                <w:color w:val="000000"/>
+                <w:kern w:val="0"/>
+                <w14:ligatures w14:val="none"/>
+              </w:rPr>
+            </w:pPr>
           </w:p>
         </w:tc>
       </w:tr>

</xml_diff>

<commit_message>
updated info/rules doc with phone numbers
</commit_message>
<xml_diff>
--- a/public/docs/Bottoms Up 2026 League Info and Rules (03-29-26).docx
+++ b/public/docs/Bottoms Up 2026 League Info and Rules (03-29-26).docx
@@ -2306,7 +2306,7 @@
     <w:tbl>
       <w:tblPr>
         <w:tblpPr w:leftFromText="180" w:rightFromText="180" w:vertAnchor="page" w:horzAnchor="page" w:tblpXSpec="center" w:tblpY="3376"/>
-        <w:tblW w:w="4945" w:type="dxa"/>
+        <w:tblW w:w="7915" w:type="dxa"/>
         <w:tblBorders>
           <w:top w:val="single" w:sz="4" w:space="0" w:color="auto"/>
           <w:left w:val="single" w:sz="4" w:space="0" w:color="auto"/>
@@ -2322,6 +2322,7 @@
         <w:gridCol w:w="1435"/>
         <w:gridCol w:w="1360"/>
         <w:gridCol w:w="1525"/>
+        <w:gridCol w:w="2970"/>
       </w:tblGrid>
       <w:tr>
         <w:trPr>
@@ -2378,25 +2379,33 @@
                 <w:kern w:val="0"/>
                 <w14:ligatures w14:val="none"/>
               </w:rPr>
-              <w:t>202</w:t>
-            </w:r>
-            <w:r>
-              <w:rPr>
-                <w:rFonts w:ascii="Calibri" w:eastAsia="Times New Roman" w:hAnsi="Calibri" w:cs="Calibri"/>
-                <w:color w:val="000000"/>
-                <w:kern w:val="0"/>
-                <w14:ligatures w14:val="none"/>
-              </w:rPr>
-              <w:t>6</w:t>
-            </w:r>
-            <w:r>
-              <w:rPr>
-                <w:rFonts w:ascii="Calibri" w:eastAsia="Times New Roman" w:hAnsi="Calibri" w:cs="Calibri"/>
-                <w:color w:val="000000"/>
-                <w:kern w:val="0"/>
-                <w14:ligatures w14:val="none"/>
-              </w:rPr>
-              <w:t xml:space="preserve"> Status</w:t>
+              <w:t>Phone</w:t>
+            </w:r>
+          </w:p>
+        </w:tc>
+        <w:tc>
+          <w:tcPr>
+            <w:tcW w:w="2970" w:type="dxa"/>
+          </w:tcPr>
+          <w:p>
+            <w:pPr>
+              <w:spacing w:after="0" w:line="240" w:lineRule="auto"/>
+              <w:jc w:val="center"/>
+              <w:rPr>
+                <w:rFonts w:ascii="Calibri" w:eastAsia="Times New Roman" w:hAnsi="Calibri" w:cs="Calibri"/>
+                <w:color w:val="000000"/>
+                <w:kern w:val="0"/>
+                <w14:ligatures w14:val="none"/>
+              </w:rPr>
+            </w:pPr>
+            <w:r>
+              <w:rPr>
+                <w:rFonts w:ascii="Calibri" w:eastAsia="Times New Roman" w:hAnsi="Calibri" w:cs="Calibri"/>
+                <w:color w:val="000000"/>
+                <w:kern w:val="0"/>
+                <w14:ligatures w14:val="none"/>
+              </w:rPr>
+              <w:t>E-Mail</w:t>
             </w:r>
           </w:p>
         </w:tc>
@@ -2509,8 +2518,25 @@
                 <w:kern w:val="0"/>
                 <w14:ligatures w14:val="none"/>
               </w:rPr>
-              <w:t>TBD</w:t>
-            </w:r>
+              <w:t>719-210-8393</w:t>
+            </w:r>
+          </w:p>
+        </w:tc>
+        <w:tc>
+          <w:tcPr>
+            <w:tcW w:w="2970" w:type="dxa"/>
+          </w:tcPr>
+          <w:p>
+            <w:pPr>
+              <w:spacing w:after="0" w:line="240" w:lineRule="auto"/>
+              <w:jc w:val="center"/>
+              <w:rPr>
+                <w:rFonts w:ascii="Calibri" w:eastAsia="Times New Roman" w:hAnsi="Calibri" w:cs="Calibri"/>
+                <w:color w:val="000000"/>
+                <w:kern w:val="0"/>
+                <w14:ligatures w14:val="none"/>
+              </w:rPr>
+            </w:pPr>
           </w:p>
         </w:tc>
       </w:tr>
@@ -2622,8 +2648,25 @@
                 <w:kern w:val="0"/>
                 <w14:ligatures w14:val="none"/>
               </w:rPr>
-              <w:t>TBD</w:t>
-            </w:r>
+              <w:t>719-232-2856</w:t>
+            </w:r>
+          </w:p>
+        </w:tc>
+        <w:tc>
+          <w:tcPr>
+            <w:tcW w:w="2970" w:type="dxa"/>
+          </w:tcPr>
+          <w:p>
+            <w:pPr>
+              <w:spacing w:after="0" w:line="240" w:lineRule="auto"/>
+              <w:jc w:val="center"/>
+              <w:rPr>
+                <w:rFonts w:ascii="Calibri" w:eastAsia="Times New Roman" w:hAnsi="Calibri" w:cs="Calibri"/>
+                <w:color w:val="000000"/>
+                <w:kern w:val="0"/>
+                <w14:ligatures w14:val="none"/>
+              </w:rPr>
+            </w:pPr>
           </w:p>
         </w:tc>
       </w:tr>
@@ -2735,8 +2778,25 @@
                 <w:kern w:val="0"/>
                 <w14:ligatures w14:val="none"/>
               </w:rPr>
-              <w:t>TBD</w:t>
-            </w:r>
+              <w:t>719-460-9413</w:t>
+            </w:r>
+          </w:p>
+        </w:tc>
+        <w:tc>
+          <w:tcPr>
+            <w:tcW w:w="2970" w:type="dxa"/>
+          </w:tcPr>
+          <w:p>
+            <w:pPr>
+              <w:spacing w:after="0" w:line="240" w:lineRule="auto"/>
+              <w:jc w:val="center"/>
+              <w:rPr>
+                <w:rFonts w:ascii="Calibri" w:eastAsia="Times New Roman" w:hAnsi="Calibri" w:cs="Calibri"/>
+                <w:color w:val="000000"/>
+                <w:kern w:val="0"/>
+                <w14:ligatures w14:val="none"/>
+              </w:rPr>
+            </w:pPr>
           </w:p>
         </w:tc>
       </w:tr>
@@ -2848,8 +2908,25 @@
                 <w:kern w:val="0"/>
                 <w14:ligatures w14:val="none"/>
               </w:rPr>
-              <w:t>TBD</w:t>
-            </w:r>
+              <w:t>719-648-9842</w:t>
+            </w:r>
+          </w:p>
+        </w:tc>
+        <w:tc>
+          <w:tcPr>
+            <w:tcW w:w="2970" w:type="dxa"/>
+          </w:tcPr>
+          <w:p>
+            <w:pPr>
+              <w:spacing w:after="0" w:line="240" w:lineRule="auto"/>
+              <w:jc w:val="center"/>
+              <w:rPr>
+                <w:rFonts w:ascii="Calibri" w:eastAsia="Times New Roman" w:hAnsi="Calibri" w:cs="Calibri"/>
+                <w:color w:val="000000"/>
+                <w:kern w:val="0"/>
+                <w14:ligatures w14:val="none"/>
+              </w:rPr>
+            </w:pPr>
           </w:p>
         </w:tc>
       </w:tr>
@@ -2958,8 +3035,25 @@
                 <w:kern w:val="0"/>
                 <w14:ligatures w14:val="none"/>
               </w:rPr>
-              <w:t>TBD</w:t>
-            </w:r>
+              <w:t>719-661-5758</w:t>
+            </w:r>
+          </w:p>
+        </w:tc>
+        <w:tc>
+          <w:tcPr>
+            <w:tcW w:w="2970" w:type="dxa"/>
+          </w:tcPr>
+          <w:p>
+            <w:pPr>
+              <w:spacing w:after="0" w:line="240" w:lineRule="auto"/>
+              <w:jc w:val="center"/>
+              <w:rPr>
+                <w:rFonts w:ascii="Calibri" w:eastAsia="Times New Roman" w:hAnsi="Calibri" w:cs="Calibri"/>
+                <w:color w:val="000000"/>
+                <w:kern w:val="0"/>
+                <w14:ligatures w14:val="none"/>
+              </w:rPr>
+            </w:pPr>
           </w:p>
         </w:tc>
       </w:tr>
@@ -3071,8 +3165,25 @@
                 <w:kern w:val="0"/>
                 <w14:ligatures w14:val="none"/>
               </w:rPr>
-              <w:t>TBD</w:t>
-            </w:r>
+              <w:t>719-200-1629</w:t>
+            </w:r>
+          </w:p>
+        </w:tc>
+        <w:tc>
+          <w:tcPr>
+            <w:tcW w:w="2970" w:type="dxa"/>
+          </w:tcPr>
+          <w:p>
+            <w:pPr>
+              <w:spacing w:after="0" w:line="240" w:lineRule="auto"/>
+              <w:jc w:val="center"/>
+              <w:rPr>
+                <w:rFonts w:ascii="Calibri" w:eastAsia="Times New Roman" w:hAnsi="Calibri" w:cs="Calibri"/>
+                <w:color w:val="000000"/>
+                <w:kern w:val="0"/>
+                <w14:ligatures w14:val="none"/>
+              </w:rPr>
+            </w:pPr>
           </w:p>
         </w:tc>
       </w:tr>
@@ -3181,8 +3292,25 @@
                 <w:kern w:val="0"/>
                 <w14:ligatures w14:val="none"/>
               </w:rPr>
-              <w:t>TBD</w:t>
-            </w:r>
+              <w:t>808-283-4966</w:t>
+            </w:r>
+          </w:p>
+        </w:tc>
+        <w:tc>
+          <w:tcPr>
+            <w:tcW w:w="2970" w:type="dxa"/>
+          </w:tcPr>
+          <w:p>
+            <w:pPr>
+              <w:spacing w:after="0" w:line="240" w:lineRule="auto"/>
+              <w:jc w:val="center"/>
+              <w:rPr>
+                <w:rFonts w:ascii="Calibri" w:eastAsia="Times New Roman" w:hAnsi="Calibri" w:cs="Calibri"/>
+                <w:color w:val="000000"/>
+                <w:kern w:val="0"/>
+                <w14:ligatures w14:val="none"/>
+              </w:rPr>
+            </w:pPr>
           </w:p>
         </w:tc>
       </w:tr>
@@ -3291,8 +3419,25 @@
                 <w:kern w:val="0"/>
                 <w14:ligatures w14:val="none"/>
               </w:rPr>
-              <w:t>TBD</w:t>
-            </w:r>
+              <w:t>719-322-6719</w:t>
+            </w:r>
+          </w:p>
+        </w:tc>
+        <w:tc>
+          <w:tcPr>
+            <w:tcW w:w="2970" w:type="dxa"/>
+          </w:tcPr>
+          <w:p>
+            <w:pPr>
+              <w:spacing w:after="0" w:line="240" w:lineRule="auto"/>
+              <w:jc w:val="center"/>
+              <w:rPr>
+                <w:rFonts w:ascii="Calibri" w:eastAsia="Times New Roman" w:hAnsi="Calibri" w:cs="Calibri"/>
+                <w:color w:val="000000"/>
+                <w:kern w:val="0"/>
+                <w14:ligatures w14:val="none"/>
+              </w:rPr>
+            </w:pPr>
           </w:p>
         </w:tc>
       </w:tr>
@@ -3404,8 +3549,25 @@
                 <w:kern w:val="0"/>
                 <w14:ligatures w14:val="none"/>
               </w:rPr>
-              <w:t>TBD</w:t>
-            </w:r>
+              <w:t>719-330-8977</w:t>
+            </w:r>
+          </w:p>
+        </w:tc>
+        <w:tc>
+          <w:tcPr>
+            <w:tcW w:w="2970" w:type="dxa"/>
+          </w:tcPr>
+          <w:p>
+            <w:pPr>
+              <w:spacing w:after="0" w:line="240" w:lineRule="auto"/>
+              <w:jc w:val="center"/>
+              <w:rPr>
+                <w:rFonts w:ascii="Calibri" w:eastAsia="Times New Roman" w:hAnsi="Calibri" w:cs="Calibri"/>
+                <w:color w:val="000000"/>
+                <w:kern w:val="0"/>
+                <w14:ligatures w14:val="none"/>
+              </w:rPr>
+            </w:pPr>
           </w:p>
         </w:tc>
       </w:tr>
@@ -3514,8 +3676,25 @@
                 <w:kern w:val="0"/>
                 <w14:ligatures w14:val="none"/>
               </w:rPr>
-              <w:t>TBD</w:t>
-            </w:r>
+              <w:t>719-369-9966</w:t>
+            </w:r>
+          </w:p>
+        </w:tc>
+        <w:tc>
+          <w:tcPr>
+            <w:tcW w:w="2970" w:type="dxa"/>
+          </w:tcPr>
+          <w:p>
+            <w:pPr>
+              <w:spacing w:after="0" w:line="240" w:lineRule="auto"/>
+              <w:jc w:val="center"/>
+              <w:rPr>
+                <w:rFonts w:ascii="Calibri" w:eastAsia="Times New Roman" w:hAnsi="Calibri" w:cs="Calibri"/>
+                <w:color w:val="000000"/>
+                <w:kern w:val="0"/>
+                <w14:ligatures w14:val="none"/>
+              </w:rPr>
+            </w:pPr>
           </w:p>
         </w:tc>
       </w:tr>
@@ -3624,8 +3803,25 @@
                 <w:kern w:val="0"/>
                 <w14:ligatures w14:val="none"/>
               </w:rPr>
-              <w:t>TBD</w:t>
-            </w:r>
+              <w:t>719-231-5391</w:t>
+            </w:r>
+          </w:p>
+        </w:tc>
+        <w:tc>
+          <w:tcPr>
+            <w:tcW w:w="2970" w:type="dxa"/>
+          </w:tcPr>
+          <w:p>
+            <w:pPr>
+              <w:spacing w:after="0" w:line="240" w:lineRule="auto"/>
+              <w:jc w:val="center"/>
+              <w:rPr>
+                <w:rFonts w:ascii="Calibri" w:eastAsia="Times New Roman" w:hAnsi="Calibri" w:cs="Calibri"/>
+                <w:color w:val="000000"/>
+                <w:kern w:val="0"/>
+                <w14:ligatures w14:val="none"/>
+              </w:rPr>
+            </w:pPr>
           </w:p>
         </w:tc>
       </w:tr>
@@ -3737,8 +3933,25 @@
                 <w:kern w:val="0"/>
                 <w14:ligatures w14:val="none"/>
               </w:rPr>
-              <w:t>TBD</w:t>
-            </w:r>
+              <w:t>719-761-1386</w:t>
+            </w:r>
+          </w:p>
+        </w:tc>
+        <w:tc>
+          <w:tcPr>
+            <w:tcW w:w="2970" w:type="dxa"/>
+          </w:tcPr>
+          <w:p>
+            <w:pPr>
+              <w:spacing w:after="0" w:line="240" w:lineRule="auto"/>
+              <w:jc w:val="center"/>
+              <w:rPr>
+                <w:rFonts w:ascii="Calibri" w:eastAsia="Times New Roman" w:hAnsi="Calibri" w:cs="Calibri"/>
+                <w:color w:val="000000"/>
+                <w:kern w:val="0"/>
+                <w14:ligatures w14:val="none"/>
+              </w:rPr>
+            </w:pPr>
           </w:p>
         </w:tc>
       </w:tr>
@@ -3859,8 +4072,25 @@
                 <w:kern w:val="0"/>
                 <w14:ligatures w14:val="none"/>
               </w:rPr>
-              <w:t>TBD</w:t>
-            </w:r>
+              <w:t>719-650-1662</w:t>
+            </w:r>
+          </w:p>
+        </w:tc>
+        <w:tc>
+          <w:tcPr>
+            <w:tcW w:w="2970" w:type="dxa"/>
+          </w:tcPr>
+          <w:p>
+            <w:pPr>
+              <w:spacing w:after="0" w:line="240" w:lineRule="auto"/>
+              <w:jc w:val="center"/>
+              <w:rPr>
+                <w:rFonts w:ascii="Calibri" w:eastAsia="Times New Roman" w:hAnsi="Calibri" w:cs="Calibri"/>
+                <w:color w:val="000000"/>
+                <w:kern w:val="0"/>
+                <w14:ligatures w14:val="none"/>
+              </w:rPr>
+            </w:pPr>
           </w:p>
         </w:tc>
       </w:tr>
@@ -3981,8 +4211,25 @@
                 <w:kern w:val="0"/>
                 <w14:ligatures w14:val="none"/>
               </w:rPr>
-              <w:t>TBD</w:t>
-            </w:r>
+              <w:t>540-664-3049</w:t>
+            </w:r>
+          </w:p>
+        </w:tc>
+        <w:tc>
+          <w:tcPr>
+            <w:tcW w:w="2970" w:type="dxa"/>
+          </w:tcPr>
+          <w:p>
+            <w:pPr>
+              <w:spacing w:after="0" w:line="240" w:lineRule="auto"/>
+              <w:jc w:val="center"/>
+              <w:rPr>
+                <w:rFonts w:ascii="Calibri" w:eastAsia="Times New Roman" w:hAnsi="Calibri" w:cs="Calibri"/>
+                <w:color w:val="000000"/>
+                <w:kern w:val="0"/>
+                <w14:ligatures w14:val="none"/>
+              </w:rPr>
+            </w:pPr>
           </w:p>
         </w:tc>
       </w:tr>
@@ -4094,8 +4341,25 @@
                 <w:kern w:val="0"/>
                 <w14:ligatures w14:val="none"/>
               </w:rPr>
-              <w:t>TBD</w:t>
-            </w:r>
+              <w:t>703-317-7788</w:t>
+            </w:r>
+          </w:p>
+        </w:tc>
+        <w:tc>
+          <w:tcPr>
+            <w:tcW w:w="2970" w:type="dxa"/>
+          </w:tcPr>
+          <w:p>
+            <w:pPr>
+              <w:spacing w:after="0" w:line="240" w:lineRule="auto"/>
+              <w:jc w:val="center"/>
+              <w:rPr>
+                <w:rFonts w:ascii="Calibri" w:eastAsia="Times New Roman" w:hAnsi="Calibri" w:cs="Calibri"/>
+                <w:color w:val="000000"/>
+                <w:kern w:val="0"/>
+                <w14:ligatures w14:val="none"/>
+              </w:rPr>
+            </w:pPr>
           </w:p>
         </w:tc>
       </w:tr>
@@ -4207,8 +4471,25 @@
                 <w:kern w:val="0"/>
                 <w14:ligatures w14:val="none"/>
               </w:rPr>
-              <w:t>TBD</w:t>
-            </w:r>
+              <w:t>719-291-0164</w:t>
+            </w:r>
+          </w:p>
+        </w:tc>
+        <w:tc>
+          <w:tcPr>
+            <w:tcW w:w="2970" w:type="dxa"/>
+          </w:tcPr>
+          <w:p>
+            <w:pPr>
+              <w:spacing w:after="0" w:line="240" w:lineRule="auto"/>
+              <w:jc w:val="center"/>
+              <w:rPr>
+                <w:rFonts w:ascii="Calibri" w:eastAsia="Times New Roman" w:hAnsi="Calibri" w:cs="Calibri"/>
+                <w:color w:val="000000"/>
+                <w:kern w:val="0"/>
+                <w14:ligatures w14:val="none"/>
+              </w:rPr>
+            </w:pPr>
           </w:p>
         </w:tc>
       </w:tr>
@@ -4320,8 +4601,25 @@
                 <w:kern w:val="0"/>
                 <w14:ligatures w14:val="none"/>
               </w:rPr>
-              <w:t>TBD</w:t>
-            </w:r>
+              <w:t>970-903-7825</w:t>
+            </w:r>
+          </w:p>
+        </w:tc>
+        <w:tc>
+          <w:tcPr>
+            <w:tcW w:w="2970" w:type="dxa"/>
+          </w:tcPr>
+          <w:p>
+            <w:pPr>
+              <w:spacing w:after="0" w:line="240" w:lineRule="auto"/>
+              <w:jc w:val="center"/>
+              <w:rPr>
+                <w:rFonts w:ascii="Calibri" w:eastAsia="Times New Roman" w:hAnsi="Calibri" w:cs="Calibri"/>
+                <w:color w:val="000000"/>
+                <w:kern w:val="0"/>
+                <w14:ligatures w14:val="none"/>
+              </w:rPr>
+            </w:pPr>
           </w:p>
         </w:tc>
       </w:tr>
@@ -4414,6 +4712,32 @@
                 <w14:ligatures w14:val="none"/>
               </w:rPr>
             </w:pPr>
+            <w:r>
+              <w:rPr>
+                <w:rFonts w:ascii="Calibri" w:eastAsia="Times New Roman" w:hAnsi="Calibri" w:cs="Calibri"/>
+                <w:color w:val="000000"/>
+                <w:kern w:val="0"/>
+                <w14:ligatures w14:val="none"/>
+              </w:rPr>
+              <w:t>719-659-2276</w:t>
+            </w:r>
+          </w:p>
+        </w:tc>
+        <w:tc>
+          <w:tcPr>
+            <w:tcW w:w="2970" w:type="dxa"/>
+          </w:tcPr>
+          <w:p>
+            <w:pPr>
+              <w:spacing w:after="0" w:line="240" w:lineRule="auto"/>
+              <w:jc w:val="center"/>
+              <w:rPr>
+                <w:rFonts w:ascii="Calibri" w:eastAsia="Times New Roman" w:hAnsi="Calibri" w:cs="Calibri"/>
+                <w:color w:val="000000"/>
+                <w:kern w:val="0"/>
+                <w14:ligatures w14:val="none"/>
+              </w:rPr>
+            </w:pPr>
           </w:p>
         </w:tc>
       </w:tr>
@@ -4506,6 +4830,32 @@
                 <w14:ligatures w14:val="none"/>
               </w:rPr>
             </w:pPr>
+            <w:r>
+              <w:rPr>
+                <w:rFonts w:ascii="Calibri" w:eastAsia="Times New Roman" w:hAnsi="Calibri" w:cs="Calibri"/>
+                <w:color w:val="000000"/>
+                <w:kern w:val="0"/>
+                <w14:ligatures w14:val="none"/>
+              </w:rPr>
+              <w:t>719-322-5812</w:t>
+            </w:r>
+          </w:p>
+        </w:tc>
+        <w:tc>
+          <w:tcPr>
+            <w:tcW w:w="2970" w:type="dxa"/>
+          </w:tcPr>
+          <w:p>
+            <w:pPr>
+              <w:spacing w:after="0" w:line="240" w:lineRule="auto"/>
+              <w:jc w:val="center"/>
+              <w:rPr>
+                <w:rFonts w:ascii="Calibri" w:eastAsia="Times New Roman" w:hAnsi="Calibri" w:cs="Calibri"/>
+                <w:color w:val="000000"/>
+                <w:kern w:val="0"/>
+                <w14:ligatures w14:val="none"/>
+              </w:rPr>
+            </w:pPr>
           </w:p>
         </w:tc>
       </w:tr>
@@ -4598,6 +4948,32 @@
                 <w14:ligatures w14:val="none"/>
               </w:rPr>
             </w:pPr>
+            <w:r>
+              <w:rPr>
+                <w:rFonts w:ascii="Calibri" w:eastAsia="Times New Roman" w:hAnsi="Calibri" w:cs="Calibri"/>
+                <w:color w:val="000000"/>
+                <w:kern w:val="0"/>
+                <w14:ligatures w14:val="none"/>
+              </w:rPr>
+              <w:t>719-237-6675</w:t>
+            </w:r>
+          </w:p>
+        </w:tc>
+        <w:tc>
+          <w:tcPr>
+            <w:tcW w:w="2970" w:type="dxa"/>
+          </w:tcPr>
+          <w:p>
+            <w:pPr>
+              <w:spacing w:after="0" w:line="240" w:lineRule="auto"/>
+              <w:jc w:val="center"/>
+              <w:rPr>
+                <w:rFonts w:ascii="Calibri" w:eastAsia="Times New Roman" w:hAnsi="Calibri" w:cs="Calibri"/>
+                <w:color w:val="000000"/>
+                <w:kern w:val="0"/>
+                <w14:ligatures w14:val="none"/>
+              </w:rPr>
+            </w:pPr>
           </w:p>
         </w:tc>
       </w:tr>
@@ -4692,6 +5068,32 @@
                 <w14:ligatures w14:val="none"/>
               </w:rPr>
             </w:pPr>
+            <w:r>
+              <w:rPr>
+                <w:rFonts w:ascii="Calibri" w:eastAsia="Times New Roman" w:hAnsi="Calibri" w:cs="Calibri"/>
+                <w:color w:val="000000"/>
+                <w:kern w:val="0"/>
+                <w14:ligatures w14:val="none"/>
+              </w:rPr>
+              <w:t>719-400-9935</w:t>
+            </w:r>
+          </w:p>
+        </w:tc>
+        <w:tc>
+          <w:tcPr>
+            <w:tcW w:w="2970" w:type="dxa"/>
+          </w:tcPr>
+          <w:p>
+            <w:pPr>
+              <w:spacing w:after="0" w:line="240" w:lineRule="auto"/>
+              <w:jc w:val="center"/>
+              <w:rPr>
+                <w:rFonts w:ascii="Calibri" w:eastAsia="Times New Roman" w:hAnsi="Calibri" w:cs="Calibri"/>
+                <w:color w:val="000000"/>
+                <w:kern w:val="0"/>
+                <w14:ligatures w14:val="none"/>
+              </w:rPr>
+            </w:pPr>
           </w:p>
         </w:tc>
       </w:tr>
@@ -4784,6 +5186,32 @@
                 <w14:ligatures w14:val="none"/>
               </w:rPr>
             </w:pPr>
+            <w:r>
+              <w:rPr>
+                <w:rFonts w:ascii="Calibri" w:eastAsia="Times New Roman" w:hAnsi="Calibri" w:cs="Calibri"/>
+                <w:color w:val="000000"/>
+                <w:kern w:val="0"/>
+                <w14:ligatures w14:val="none"/>
+              </w:rPr>
+              <w:t>719-396-9998</w:t>
+            </w:r>
+          </w:p>
+        </w:tc>
+        <w:tc>
+          <w:tcPr>
+            <w:tcW w:w="2970" w:type="dxa"/>
+          </w:tcPr>
+          <w:p>
+            <w:pPr>
+              <w:spacing w:after="0" w:line="240" w:lineRule="auto"/>
+              <w:jc w:val="center"/>
+              <w:rPr>
+                <w:rFonts w:ascii="Calibri" w:eastAsia="Times New Roman" w:hAnsi="Calibri" w:cs="Calibri"/>
+                <w:color w:val="000000"/>
+                <w:kern w:val="0"/>
+                <w14:ligatures w14:val="none"/>
+              </w:rPr>
+            </w:pPr>
           </w:p>
         </w:tc>
       </w:tr>
@@ -4864,6 +5292,23 @@
         <w:tc>
           <w:tcPr>
             <w:tcW w:w="1525" w:type="dxa"/>
+          </w:tcPr>
+          <w:p>
+            <w:pPr>
+              <w:spacing w:after="0" w:line="240" w:lineRule="auto"/>
+              <w:jc w:val="center"/>
+              <w:rPr>
+                <w:rFonts w:ascii="Calibri" w:eastAsia="Times New Roman" w:hAnsi="Calibri" w:cs="Calibri"/>
+                <w:color w:val="000000"/>
+                <w:kern w:val="0"/>
+                <w14:ligatures w14:val="none"/>
+              </w:rPr>
+            </w:pPr>
+          </w:p>
+        </w:tc>
+        <w:tc>
+          <w:tcPr>
+            <w:tcW w:w="2970" w:type="dxa"/>
           </w:tcPr>
           <w:p>
             <w:pPr>

</xml_diff>

<commit_message>
added a header title as a variable.  if = local then title is "Bottoms Up Golf (LOCAL)"...if not it is "Bottoms Up Golf"..also removed the roster from the league rules and info doc.  It requires auth in order to view that PII
</commit_message>
<xml_diff>
--- a/public/docs/Bottoms Up 2026 League Info and Rules (03-29-26).docx
+++ b/public/docs/Bottoms Up 2026 League Info and Rules (03-29-26).docx
@@ -1,6 +1,6 @@
 
 <file path=word/document.xml><?xml version="1.0" encoding="utf-8"?>
-<w:document xmlns:wpc="http://schemas.microsoft.com/office/word/2010/wordprocessingCanvas" xmlns:cx="http://schemas.microsoft.com/office/drawing/2014/chartex" xmlns:cx1="http://schemas.microsoft.com/office/drawing/2015/9/8/chartex" xmlns:cx2="http://schemas.microsoft.com/office/drawing/2015/10/21/chartex" xmlns:cx3="http://schemas.microsoft.com/office/drawing/2016/5/9/chartex" xmlns:cx4="http://schemas.microsoft.com/office/drawing/2016/5/10/chartex" xmlns:cx5="http://schemas.microsoft.com/office/drawing/2016/5/11/chartex" xmlns:cx6="http://schemas.microsoft.com/office/drawing/2016/5/12/chartex" xmlns:cx7="http://schemas.microsoft.com/office/drawing/2016/5/13/chartex" xmlns:cx8="http://schemas.microsoft.com/office/drawing/2016/5/14/chartex" xmlns:mc="http://schemas.openxmlformats.org/markup-compatibility/2006" xmlns:aink="http://schemas.microsoft.com/office/drawing/2016/ink" xmlns:am3d="http://schemas.microsoft.com/office/drawing/2017/model3d" xmlns:o="urn:schemas-microsoft-com:office:office" xmlns:oel="http://schemas.microsoft.com/office/2019/extlst" xmlns:r="http://schemas.openxmlformats.org/officeDocument/2006/relationships" xmlns:m="http://schemas.openxmlformats.org/officeDocument/2006/math" xmlns:v="urn:schemas-microsoft-com:vml" xmlns:wp14="http://schemas.microsoft.com/office/word/2010/wordprocessingDrawing" xmlns:wp="http://schemas.openxmlformats.org/drawingml/2006/wordprocessingDrawing" xmlns:w10="urn:schemas-microsoft-com:office:word" xmlns:w="http://schemas.openxmlformats.org/wordprocessingml/2006/main" xmlns:w14="http://schemas.microsoft.com/office/word/2010/wordml" xmlns:w15="http://schemas.microsoft.com/office/word/2012/wordml" xmlns:w16cex="http://schemas.microsoft.com/office/word/2018/wordml/cex" xmlns:w16cid="http://schemas.microsoft.com/office/word/2016/wordml/cid" xmlns:w16="http://schemas.microsoft.com/office/word/2018/wordml" xmlns:w16du="http://schemas.microsoft.com/office/word/2023/wordml/word16du" xmlns:w16sdtdh="http://schemas.microsoft.com/office/word/2020/wordml/sdtdatahash" xmlns:w16sdtfl="http://schemas.microsoft.com/office/word/2024/wordml/sdtformatlock" xmlns:w16se="http://schemas.microsoft.com/office/word/2015/wordml/symex" xmlns:wpg="http://schemas.microsoft.com/office/word/2010/wordprocessingGroup" xmlns:wpi="http://schemas.microsoft.com/office/word/2010/wordprocessingInk" xmlns:wne="http://schemas.microsoft.com/office/word/2006/wordml" xmlns:wps="http://schemas.microsoft.com/office/word/2010/wordprocessingShape" mc:Ignorable="w14 w15 w16se w16cid w16 w16cex w16sdtdh w16sdtfl w16du wp14">
+<w:document xmlns:wpc="http://schemas.microsoft.com/office/word/2010/wordprocessingCanvas" xmlns:cx="http://schemas.microsoft.com/office/drawing/2014/chartex" xmlns:cx1="http://schemas.microsoft.com/office/drawing/2015/9/8/chartex" xmlns:cx2="http://schemas.microsoft.com/office/drawing/2015/10/21/chartex" xmlns:cx3="http://schemas.microsoft.com/office/drawing/2016/5/9/chartex" xmlns:cx4="http://schemas.microsoft.com/office/drawing/2016/5/10/chartex" xmlns:cx5="http://schemas.microsoft.com/office/drawing/2016/5/11/chartex" xmlns:cx6="http://schemas.microsoft.com/office/drawing/2016/5/12/chartex" xmlns:cx7="http://schemas.microsoft.com/office/drawing/2016/5/13/chartex" xmlns:cx8="http://schemas.microsoft.com/office/drawing/2016/5/14/chartex" xmlns:mc="http://schemas.openxmlformats.org/markup-compatibility/2006" xmlns:m="http://schemas.openxmlformats.org/officeDocument/2006/math" xmlns:aink="http://schemas.microsoft.com/office/drawing/2016/ink" xmlns:am3d="http://schemas.microsoft.com/office/drawing/2017/model3d" xmlns:oel="http://schemas.microsoft.com/office/2019/extlst" xmlns:r="http://schemas.openxmlformats.org/officeDocument/2006/relationships" xmlns:wp14="http://schemas.microsoft.com/office/word/2010/wordprocessingDrawing" xmlns:wp="http://schemas.openxmlformats.org/drawingml/2006/wordprocessingDrawing" xmlns:wpg="http://schemas.microsoft.com/office/word/2010/wordprocessingGroup" xmlns:wpi="http://schemas.microsoft.com/office/word/2010/wordprocessingInk" xmlns:wps="http://schemas.microsoft.com/office/word/2010/wordprocessingShape" xmlns:o="urn:schemas-microsoft-com:office:office" xmlns:v="urn:schemas-microsoft-com:vml" xmlns:w10="urn:schemas-microsoft-com:office:word" xmlns:w="http://schemas.openxmlformats.org/wordprocessingml/2006/main" xmlns:w14="http://schemas.microsoft.com/office/word/2010/wordml" xmlns:w15="http://schemas.microsoft.com/office/word/2012/wordml" xmlns:w16cex="http://schemas.microsoft.com/office/word/2018/wordml/cex" xmlns:w16cid="http://schemas.microsoft.com/office/word/2016/wordml/cid" xmlns:w16="http://schemas.microsoft.com/office/word/2018/wordml" xmlns:w16sdtdh="http://schemas.microsoft.com/office/word/2020/wordml/sdtdatahash" xmlns:w16sdtfl="http://schemas.microsoft.com/office/word/2024/wordml/sdtformatlock" xmlns:w16se="http://schemas.microsoft.com/office/word/2015/wordml/symex" xmlns:w16du="http://schemas.microsoft.com/office/word/2023/wordml/word16du" xmlns:wne="http://schemas.microsoft.com/office/word/2006/wordml" mc:Ignorable="w14 w15 w16se w16cid w16 w16cex w16sdtdh w16sdtfl w16du wp14">
   <w:body>
     <w:p>
       <w:pPr>
@@ -2266,2067 +2266,6 @@
         <w:br w:type="page"/>
       </w:r>
     </w:p>
-    <w:p>
-      <w:pPr>
-        <w:pStyle w:val="Title"/>
-        <w:jc w:val="center"/>
-        <w:rPr>
-          <w:sz w:val="44"/>
-          <w:szCs w:val="44"/>
-        </w:rPr>
-      </w:pPr>
-      <w:r>
-        <w:rPr>
-          <w:b/>
-          <w:bCs/>
-          <w:sz w:val="44"/>
-          <w:szCs w:val="44"/>
-        </w:rPr>
-        <w:lastRenderedPageBreak/>
-        <w:t>Bottoms Up 2026</w:t>
-      </w:r>
-      <w:r>
-        <w:rPr>
-          <w:b/>
-          <w:bCs/>
-          <w:sz w:val="44"/>
-          <w:szCs w:val="44"/>
-        </w:rPr>
-        <w:t xml:space="preserve"> Roster</w:t>
-      </w:r>
-      <w:r>
-        <w:rPr>
-          <w:sz w:val="44"/>
-          <w:szCs w:val="44"/>
-        </w:rPr>
-        <w:t xml:space="preserve"> </w:t>
-      </w:r>
-    </w:p>
-    <w:p/>
-    <w:tbl>
-      <w:tblPr>
-        <w:tblpPr w:leftFromText="180" w:rightFromText="180" w:vertAnchor="page" w:horzAnchor="page" w:tblpXSpec="center" w:tblpY="3376"/>
-        <w:tblW w:w="4945" w:type="dxa"/>
-        <w:tblBorders>
-          <w:top w:val="single" w:sz="4" w:space="0" w:color="auto"/>
-          <w:left w:val="single" w:sz="4" w:space="0" w:color="auto"/>
-          <w:bottom w:val="single" w:sz="4" w:space="0" w:color="auto"/>
-          <w:right w:val="single" w:sz="4" w:space="0" w:color="auto"/>
-          <w:insideH w:val="single" w:sz="4" w:space="0" w:color="auto"/>
-          <w:insideV w:val="single" w:sz="4" w:space="0" w:color="auto"/>
-        </w:tblBorders>
-        <w:tblLook w:val="04A0" w:firstRow="1" w:lastRow="0" w:firstColumn="1" w:lastColumn="0" w:noHBand="0" w:noVBand="1"/>
-      </w:tblPr>
-      <w:tblGrid>
-        <w:gridCol w:w="625"/>
-        <w:gridCol w:w="1435"/>
-        <w:gridCol w:w="1360"/>
-        <w:gridCol w:w="1525"/>
-      </w:tblGrid>
-      <w:tr>
-        <w:trPr>
-          <w:trHeight w:val="315"/>
-        </w:trPr>
-        <w:tc>
-          <w:tcPr>
-            <w:tcW w:w="3420" w:type="dxa"/>
-            <w:gridSpan w:val="3"/>
-            <w:vAlign w:val="center"/>
-            <w:hideMark/>
-          </w:tcPr>
-          <w:p>
-            <w:pPr>
-              <w:spacing w:after="0" w:line="240" w:lineRule="auto"/>
-              <w:jc w:val="center"/>
-              <w:rPr>
-                <w:rFonts w:ascii="Calibri" w:eastAsia="Times New Roman" w:hAnsi="Calibri" w:cs="Calibri"/>
-                <w:color w:val="000000"/>
-                <w:kern w:val="0"/>
-                <w14:ligatures w14:val="none"/>
-              </w:rPr>
-            </w:pPr>
-            <w:r>
-              <w:rPr>
-                <w:rFonts w:ascii="Calibri" w:eastAsia="Times New Roman" w:hAnsi="Calibri" w:cs="Calibri"/>
-                <w:color w:val="000000"/>
-                <w:kern w:val="0"/>
-                <w14:ligatures w14:val="none"/>
-              </w:rPr>
-              <w:t>Players</w:t>
-            </w:r>
-          </w:p>
-        </w:tc>
-        <w:tc>
-          <w:tcPr>
-            <w:tcW w:w="1525" w:type="dxa"/>
-          </w:tcPr>
-          <w:p>
-            <w:pPr>
-              <w:spacing w:after="0" w:line="240" w:lineRule="auto"/>
-              <w:jc w:val="center"/>
-              <w:rPr>
-                <w:rFonts w:ascii="Calibri" w:eastAsia="Times New Roman" w:hAnsi="Calibri" w:cs="Calibri"/>
-                <w:color w:val="000000"/>
-                <w:kern w:val="0"/>
-                <w14:ligatures w14:val="none"/>
-              </w:rPr>
-            </w:pPr>
-            <w:r>
-              <w:rPr>
-                <w:rFonts w:ascii="Calibri" w:eastAsia="Times New Roman" w:hAnsi="Calibri" w:cs="Calibri"/>
-                <w:color w:val="000000"/>
-                <w:kern w:val="0"/>
-                <w14:ligatures w14:val="none"/>
-              </w:rPr>
-              <w:t>202</w:t>
-            </w:r>
-            <w:r>
-              <w:rPr>
-                <w:rFonts w:ascii="Calibri" w:eastAsia="Times New Roman" w:hAnsi="Calibri" w:cs="Calibri"/>
-                <w:color w:val="000000"/>
-                <w:kern w:val="0"/>
-                <w14:ligatures w14:val="none"/>
-              </w:rPr>
-              <w:t>6</w:t>
-            </w:r>
-            <w:r>
-              <w:rPr>
-                <w:rFonts w:ascii="Calibri" w:eastAsia="Times New Roman" w:hAnsi="Calibri" w:cs="Calibri"/>
-                <w:color w:val="000000"/>
-                <w:kern w:val="0"/>
-                <w14:ligatures w14:val="none"/>
-              </w:rPr>
-              <w:t xml:space="preserve"> Status</w:t>
-            </w:r>
-          </w:p>
-        </w:tc>
-      </w:tr>
-      <w:tr>
-        <w:trPr>
-          <w:trHeight w:val="300"/>
-        </w:trPr>
-        <w:tc>
-          <w:tcPr>
-            <w:tcW w:w="625" w:type="dxa"/>
-            <w:vAlign w:val="center"/>
-            <w:hideMark/>
-          </w:tcPr>
-          <w:p>
-            <w:pPr>
-              <w:spacing w:after="0" w:line="240" w:lineRule="auto"/>
-              <w:jc w:val="center"/>
-              <w:rPr>
-                <w:rFonts w:ascii="Calibri" w:eastAsia="Times New Roman" w:hAnsi="Calibri" w:cs="Calibri"/>
-                <w:color w:val="000000"/>
-                <w:kern w:val="0"/>
-                <w14:ligatures w14:val="none"/>
-              </w:rPr>
-            </w:pPr>
-            <w:r>
-              <w:rPr>
-                <w:rFonts w:ascii="Calibri" w:eastAsia="Times New Roman" w:hAnsi="Calibri" w:cs="Calibri"/>
-                <w:color w:val="000000"/>
-                <w:kern w:val="0"/>
-                <w14:ligatures w14:val="none"/>
-              </w:rPr>
-              <w:t>1</w:t>
-            </w:r>
-          </w:p>
-        </w:tc>
-        <w:tc>
-          <w:tcPr>
-            <w:tcW w:w="1435" w:type="dxa"/>
-            <w:vAlign w:val="center"/>
-            <w:hideMark/>
-          </w:tcPr>
-          <w:p>
-            <w:pPr>
-              <w:spacing w:after="0" w:line="240" w:lineRule="auto"/>
-              <w:rPr>
-                <w:rFonts w:ascii="Calibri" w:eastAsia="Times New Roman" w:hAnsi="Calibri" w:cs="Calibri"/>
-                <w:color w:val="000000"/>
-                <w:kern w:val="0"/>
-                <w14:ligatures w14:val="none"/>
-              </w:rPr>
-            </w:pPr>
-            <w:r>
-              <w:rPr>
-                <w:rFonts w:ascii="Calibri" w:eastAsia="Times New Roman" w:hAnsi="Calibri" w:cs="Calibri"/>
-                <w:color w:val="000000"/>
-                <w:kern w:val="0"/>
-                <w14:ligatures w14:val="none"/>
-              </w:rPr>
-              <w:t>Adkison</w:t>
-            </w:r>
-          </w:p>
-        </w:tc>
-        <w:tc>
-          <w:tcPr>
-            <w:tcW w:w="1360" w:type="dxa"/>
-            <w:vAlign w:val="center"/>
-            <w:hideMark/>
-          </w:tcPr>
-          <w:p>
-            <w:pPr>
-              <w:spacing w:after="0" w:line="240" w:lineRule="auto"/>
-              <w:rPr>
-                <w:rFonts w:ascii="Calibri" w:eastAsia="Times New Roman" w:hAnsi="Calibri" w:cs="Calibri"/>
-                <w:color w:val="000000"/>
-                <w:kern w:val="0"/>
-                <w14:ligatures w14:val="none"/>
-              </w:rPr>
-            </w:pPr>
-            <w:r>
-              <w:rPr>
-                <w:rFonts w:ascii="Calibri" w:eastAsia="Times New Roman" w:hAnsi="Calibri" w:cs="Calibri"/>
-                <w:color w:val="000000"/>
-                <w:kern w:val="0"/>
-                <w14:ligatures w14:val="none"/>
-              </w:rPr>
-              <w:t>Tony</w:t>
-            </w:r>
-          </w:p>
-        </w:tc>
-        <w:tc>
-          <w:tcPr>
-            <w:tcW w:w="1525" w:type="dxa"/>
-          </w:tcPr>
-          <w:p>
-            <w:pPr>
-              <w:spacing w:after="0" w:line="240" w:lineRule="auto"/>
-              <w:jc w:val="center"/>
-              <w:rPr>
-                <w:rFonts w:ascii="Calibri" w:eastAsia="Times New Roman" w:hAnsi="Calibri" w:cs="Calibri"/>
-                <w:color w:val="000000"/>
-                <w:kern w:val="0"/>
-                <w14:ligatures w14:val="none"/>
-              </w:rPr>
-            </w:pPr>
-            <w:r>
-              <w:rPr>
-                <w:rFonts w:ascii="Calibri" w:eastAsia="Times New Roman" w:hAnsi="Calibri" w:cs="Calibri"/>
-                <w:color w:val="000000"/>
-                <w:kern w:val="0"/>
-                <w14:ligatures w14:val="none"/>
-              </w:rPr>
-              <w:t>TBD</w:t>
-            </w:r>
-          </w:p>
-        </w:tc>
-      </w:tr>
-      <w:tr>
-        <w:trPr>
-          <w:trHeight w:val="300"/>
-        </w:trPr>
-        <w:tc>
-          <w:tcPr>
-            <w:tcW w:w="625" w:type="dxa"/>
-            <w:vAlign w:val="center"/>
-            <w:hideMark/>
-          </w:tcPr>
-          <w:p>
-            <w:pPr>
-              <w:spacing w:after="0" w:line="240" w:lineRule="auto"/>
-              <w:jc w:val="center"/>
-              <w:rPr>
-                <w:rFonts w:ascii="Calibri" w:eastAsia="Times New Roman" w:hAnsi="Calibri" w:cs="Calibri"/>
-                <w:color w:val="000000"/>
-                <w:kern w:val="0"/>
-                <w14:ligatures w14:val="none"/>
-              </w:rPr>
-            </w:pPr>
-            <w:r>
-              <w:rPr>
-                <w:rFonts w:ascii="Calibri" w:eastAsia="Times New Roman" w:hAnsi="Calibri" w:cs="Calibri"/>
-                <w:color w:val="000000"/>
-                <w:kern w:val="0"/>
-                <w14:ligatures w14:val="none"/>
-              </w:rPr>
-              <w:t>2</w:t>
-            </w:r>
-          </w:p>
-        </w:tc>
-        <w:tc>
-          <w:tcPr>
-            <w:tcW w:w="1435" w:type="dxa"/>
-            <w:vAlign w:val="center"/>
-            <w:hideMark/>
-          </w:tcPr>
-          <w:p>
-            <w:pPr>
-              <w:spacing w:after="0" w:line="240" w:lineRule="auto"/>
-              <w:rPr>
-                <w:rFonts w:ascii="Calibri" w:eastAsia="Times New Roman" w:hAnsi="Calibri" w:cs="Calibri"/>
-                <w:color w:val="000000"/>
-                <w:kern w:val="0"/>
-                <w14:ligatures w14:val="none"/>
-              </w:rPr>
-            </w:pPr>
-            <w:r>
-              <w:rPr>
-                <w:rFonts w:ascii="Calibri" w:eastAsia="Times New Roman" w:hAnsi="Calibri" w:cs="Calibri"/>
-                <w:color w:val="000000"/>
-                <w:kern w:val="0"/>
-                <w14:ligatures w14:val="none"/>
-              </w:rPr>
-              <w:t>Bess</w:t>
-            </w:r>
-          </w:p>
-        </w:tc>
-        <w:tc>
-          <w:tcPr>
-            <w:tcW w:w="1360" w:type="dxa"/>
-            <w:vAlign w:val="center"/>
-            <w:hideMark/>
-          </w:tcPr>
-          <w:p>
-            <w:pPr>
-              <w:spacing w:after="0" w:line="240" w:lineRule="auto"/>
-              <w:rPr>
-                <w:rFonts w:ascii="Calibri" w:eastAsia="Times New Roman" w:hAnsi="Calibri" w:cs="Calibri"/>
-                <w:color w:val="000000"/>
-                <w:kern w:val="0"/>
-                <w14:ligatures w14:val="none"/>
-              </w:rPr>
-            </w:pPr>
-            <w:r>
-              <w:rPr>
-                <w:rFonts w:ascii="Calibri" w:eastAsia="Times New Roman" w:hAnsi="Calibri" w:cs="Calibri"/>
-                <w:color w:val="000000"/>
-                <w:kern w:val="0"/>
-                <w14:ligatures w14:val="none"/>
-              </w:rPr>
-              <w:t>Ami</w:t>
-            </w:r>
-          </w:p>
-        </w:tc>
-        <w:tc>
-          <w:tcPr>
-            <w:tcW w:w="1525" w:type="dxa"/>
-          </w:tcPr>
-          <w:p>
-            <w:pPr>
-              <w:spacing w:after="0" w:line="240" w:lineRule="auto"/>
-              <w:jc w:val="center"/>
-              <w:rPr>
-                <w:rFonts w:ascii="Calibri" w:eastAsia="Times New Roman" w:hAnsi="Calibri" w:cs="Calibri"/>
-                <w:color w:val="000000"/>
-                <w:kern w:val="0"/>
-                <w14:ligatures w14:val="none"/>
-              </w:rPr>
-            </w:pPr>
-            <w:r>
-              <w:rPr>
-                <w:rFonts w:ascii="Calibri" w:eastAsia="Times New Roman" w:hAnsi="Calibri" w:cs="Calibri"/>
-                <w:color w:val="000000"/>
-                <w:kern w:val="0"/>
-                <w14:ligatures w14:val="none"/>
-              </w:rPr>
-              <w:t>TBD</w:t>
-            </w:r>
-          </w:p>
-        </w:tc>
-      </w:tr>
-      <w:tr>
-        <w:trPr>
-          <w:trHeight w:val="300"/>
-        </w:trPr>
-        <w:tc>
-          <w:tcPr>
-            <w:tcW w:w="625" w:type="dxa"/>
-            <w:vAlign w:val="center"/>
-            <w:hideMark/>
-          </w:tcPr>
-          <w:p>
-            <w:pPr>
-              <w:spacing w:after="0" w:line="240" w:lineRule="auto"/>
-              <w:jc w:val="center"/>
-              <w:rPr>
-                <w:rFonts w:ascii="Calibri" w:eastAsia="Times New Roman" w:hAnsi="Calibri" w:cs="Calibri"/>
-                <w:color w:val="000000"/>
-                <w:kern w:val="0"/>
-                <w14:ligatures w14:val="none"/>
-              </w:rPr>
-            </w:pPr>
-            <w:r>
-              <w:rPr>
-                <w:rFonts w:ascii="Calibri" w:eastAsia="Times New Roman" w:hAnsi="Calibri" w:cs="Calibri"/>
-                <w:color w:val="000000"/>
-                <w:kern w:val="0"/>
-                <w14:ligatures w14:val="none"/>
-              </w:rPr>
-              <w:t>3</w:t>
-            </w:r>
-          </w:p>
-        </w:tc>
-        <w:tc>
-          <w:tcPr>
-            <w:tcW w:w="1435" w:type="dxa"/>
-            <w:vAlign w:val="center"/>
-            <w:hideMark/>
-          </w:tcPr>
-          <w:p>
-            <w:pPr>
-              <w:spacing w:after="0" w:line="240" w:lineRule="auto"/>
-              <w:rPr>
-                <w:rFonts w:ascii="Calibri" w:eastAsia="Times New Roman" w:hAnsi="Calibri" w:cs="Calibri"/>
-                <w:color w:val="000000"/>
-                <w:kern w:val="0"/>
-                <w14:ligatures w14:val="none"/>
-              </w:rPr>
-            </w:pPr>
-            <w:r>
-              <w:rPr>
-                <w:rFonts w:ascii="Calibri" w:eastAsia="Times New Roman" w:hAnsi="Calibri" w:cs="Calibri"/>
-                <w:color w:val="000000"/>
-                <w:kern w:val="0"/>
-                <w14:ligatures w14:val="none"/>
-              </w:rPr>
-              <w:t>Bess</w:t>
-            </w:r>
-          </w:p>
-        </w:tc>
-        <w:tc>
-          <w:tcPr>
-            <w:tcW w:w="1360" w:type="dxa"/>
-            <w:vAlign w:val="center"/>
-            <w:hideMark/>
-          </w:tcPr>
-          <w:p>
-            <w:pPr>
-              <w:spacing w:after="0" w:line="240" w:lineRule="auto"/>
-              <w:rPr>
-                <w:rFonts w:ascii="Calibri" w:eastAsia="Times New Roman" w:hAnsi="Calibri" w:cs="Calibri"/>
-                <w:color w:val="000000"/>
-                <w:kern w:val="0"/>
-                <w14:ligatures w14:val="none"/>
-              </w:rPr>
-            </w:pPr>
-            <w:r>
-              <w:rPr>
-                <w:rFonts w:ascii="Calibri" w:eastAsia="Times New Roman" w:hAnsi="Calibri" w:cs="Calibri"/>
-                <w:color w:val="000000"/>
-                <w:kern w:val="0"/>
-                <w14:ligatures w14:val="none"/>
-              </w:rPr>
-              <w:t>John</w:t>
-            </w:r>
-          </w:p>
-        </w:tc>
-        <w:tc>
-          <w:tcPr>
-            <w:tcW w:w="1525" w:type="dxa"/>
-          </w:tcPr>
-          <w:p>
-            <w:pPr>
-              <w:spacing w:after="0" w:line="240" w:lineRule="auto"/>
-              <w:jc w:val="center"/>
-              <w:rPr>
-                <w:rFonts w:ascii="Calibri" w:eastAsia="Times New Roman" w:hAnsi="Calibri" w:cs="Calibri"/>
-                <w:color w:val="000000"/>
-                <w:kern w:val="0"/>
-                <w14:ligatures w14:val="none"/>
-              </w:rPr>
-            </w:pPr>
-            <w:r>
-              <w:rPr>
-                <w:rFonts w:ascii="Calibri" w:eastAsia="Times New Roman" w:hAnsi="Calibri" w:cs="Calibri"/>
-                <w:color w:val="000000"/>
-                <w:kern w:val="0"/>
-                <w14:ligatures w14:val="none"/>
-              </w:rPr>
-              <w:t>TBD</w:t>
-            </w:r>
-          </w:p>
-        </w:tc>
-      </w:tr>
-      <w:tr>
-        <w:trPr>
-          <w:trHeight w:val="300"/>
-        </w:trPr>
-        <w:tc>
-          <w:tcPr>
-            <w:tcW w:w="625" w:type="dxa"/>
-            <w:vAlign w:val="center"/>
-            <w:hideMark/>
-          </w:tcPr>
-          <w:p>
-            <w:pPr>
-              <w:spacing w:after="0" w:line="240" w:lineRule="auto"/>
-              <w:jc w:val="center"/>
-              <w:rPr>
-                <w:rFonts w:ascii="Calibri" w:eastAsia="Times New Roman" w:hAnsi="Calibri" w:cs="Calibri"/>
-                <w:color w:val="000000"/>
-                <w:kern w:val="0"/>
-                <w14:ligatures w14:val="none"/>
-              </w:rPr>
-            </w:pPr>
-            <w:r>
-              <w:rPr>
-                <w:rFonts w:ascii="Calibri" w:eastAsia="Times New Roman" w:hAnsi="Calibri" w:cs="Calibri"/>
-                <w:color w:val="000000"/>
-                <w:kern w:val="0"/>
-                <w14:ligatures w14:val="none"/>
-              </w:rPr>
-              <w:t>4</w:t>
-            </w:r>
-          </w:p>
-        </w:tc>
-        <w:tc>
-          <w:tcPr>
-            <w:tcW w:w="1435" w:type="dxa"/>
-            <w:vAlign w:val="center"/>
-            <w:hideMark/>
-          </w:tcPr>
-          <w:p>
-            <w:pPr>
-              <w:spacing w:after="0" w:line="240" w:lineRule="auto"/>
-              <w:rPr>
-                <w:rFonts w:ascii="Calibri" w:eastAsia="Times New Roman" w:hAnsi="Calibri" w:cs="Calibri"/>
-                <w:color w:val="000000"/>
-                <w:kern w:val="0"/>
-                <w14:ligatures w14:val="none"/>
-              </w:rPr>
-            </w:pPr>
-            <w:r>
-              <w:rPr>
-                <w:rFonts w:ascii="Calibri" w:eastAsia="Times New Roman" w:hAnsi="Calibri" w:cs="Calibri"/>
-                <w:color w:val="000000"/>
-                <w:kern w:val="0"/>
-                <w14:ligatures w14:val="none"/>
-              </w:rPr>
-              <w:t>Dickey</w:t>
-            </w:r>
-          </w:p>
-        </w:tc>
-        <w:tc>
-          <w:tcPr>
-            <w:tcW w:w="1360" w:type="dxa"/>
-            <w:vAlign w:val="center"/>
-            <w:hideMark/>
-          </w:tcPr>
-          <w:p>
-            <w:pPr>
-              <w:spacing w:after="0" w:line="240" w:lineRule="auto"/>
-              <w:rPr>
-                <w:rFonts w:ascii="Calibri" w:eastAsia="Times New Roman" w:hAnsi="Calibri" w:cs="Calibri"/>
-                <w:color w:val="000000"/>
-                <w:kern w:val="0"/>
-                <w14:ligatures w14:val="none"/>
-              </w:rPr>
-            </w:pPr>
-            <w:r>
-              <w:rPr>
-                <w:rFonts w:ascii="Calibri" w:eastAsia="Times New Roman" w:hAnsi="Calibri" w:cs="Calibri"/>
-                <w:color w:val="000000"/>
-                <w:kern w:val="0"/>
-                <w14:ligatures w14:val="none"/>
-              </w:rPr>
-              <w:t>Jon</w:t>
-            </w:r>
-          </w:p>
-        </w:tc>
-        <w:tc>
-          <w:tcPr>
-            <w:tcW w:w="1525" w:type="dxa"/>
-          </w:tcPr>
-          <w:p>
-            <w:pPr>
-              <w:spacing w:after="0" w:line="240" w:lineRule="auto"/>
-              <w:jc w:val="center"/>
-              <w:rPr>
-                <w:rFonts w:ascii="Calibri" w:eastAsia="Times New Roman" w:hAnsi="Calibri" w:cs="Calibri"/>
-                <w:color w:val="000000"/>
-                <w:kern w:val="0"/>
-                <w14:ligatures w14:val="none"/>
-              </w:rPr>
-            </w:pPr>
-            <w:r>
-              <w:rPr>
-                <w:rFonts w:ascii="Calibri" w:eastAsia="Times New Roman" w:hAnsi="Calibri" w:cs="Calibri"/>
-                <w:color w:val="000000"/>
-                <w:kern w:val="0"/>
-                <w14:ligatures w14:val="none"/>
-              </w:rPr>
-              <w:t>TBD</w:t>
-            </w:r>
-          </w:p>
-        </w:tc>
-      </w:tr>
-      <w:tr>
-        <w:trPr>
-          <w:trHeight w:val="300"/>
-        </w:trPr>
-        <w:tc>
-          <w:tcPr>
-            <w:tcW w:w="625" w:type="dxa"/>
-            <w:vAlign w:val="center"/>
-          </w:tcPr>
-          <w:p>
-            <w:pPr>
-              <w:spacing w:after="0" w:line="240" w:lineRule="auto"/>
-              <w:jc w:val="center"/>
-              <w:rPr>
-                <w:rFonts w:ascii="Calibri" w:eastAsia="Times New Roman" w:hAnsi="Calibri" w:cs="Calibri"/>
-                <w:color w:val="000000"/>
-                <w:kern w:val="0"/>
-                <w14:ligatures w14:val="none"/>
-              </w:rPr>
-            </w:pPr>
-            <w:r>
-              <w:rPr>
-                <w:rFonts w:ascii="Calibri" w:eastAsia="Times New Roman" w:hAnsi="Calibri" w:cs="Calibri"/>
-                <w:color w:val="000000"/>
-                <w:kern w:val="0"/>
-                <w14:ligatures w14:val="none"/>
-              </w:rPr>
-              <w:t>5</w:t>
-            </w:r>
-          </w:p>
-        </w:tc>
-        <w:tc>
-          <w:tcPr>
-            <w:tcW w:w="1435" w:type="dxa"/>
-            <w:vAlign w:val="center"/>
-          </w:tcPr>
-          <w:p>
-            <w:pPr>
-              <w:spacing w:after="0" w:line="240" w:lineRule="auto"/>
-              <w:rPr>
-                <w:rFonts w:ascii="Calibri" w:eastAsia="Times New Roman" w:hAnsi="Calibri" w:cs="Calibri"/>
-                <w:color w:val="000000"/>
-                <w:kern w:val="0"/>
-                <w14:ligatures w14:val="none"/>
-              </w:rPr>
-            </w:pPr>
-            <w:r>
-              <w:rPr>
-                <w:rFonts w:ascii="Calibri" w:eastAsia="Times New Roman" w:hAnsi="Calibri" w:cs="Calibri"/>
-                <w:color w:val="000000"/>
-                <w:kern w:val="0"/>
-                <w14:ligatures w14:val="none"/>
-              </w:rPr>
-              <w:t>Guinn</w:t>
-            </w:r>
-          </w:p>
-        </w:tc>
-        <w:tc>
-          <w:tcPr>
-            <w:tcW w:w="1360" w:type="dxa"/>
-            <w:vAlign w:val="center"/>
-          </w:tcPr>
-          <w:p>
-            <w:pPr>
-              <w:spacing w:after="0" w:line="240" w:lineRule="auto"/>
-              <w:rPr>
-                <w:rFonts w:ascii="Calibri" w:eastAsia="Times New Roman" w:hAnsi="Calibri" w:cs="Calibri"/>
-                <w:color w:val="000000"/>
-                <w:kern w:val="0"/>
-                <w14:ligatures w14:val="none"/>
-              </w:rPr>
-            </w:pPr>
-            <w:r>
-              <w:rPr>
-                <w:rFonts w:ascii="Calibri" w:eastAsia="Times New Roman" w:hAnsi="Calibri" w:cs="Calibri"/>
-                <w:color w:val="000000"/>
-                <w:kern w:val="0"/>
-                <w14:ligatures w14:val="none"/>
-              </w:rPr>
-              <w:t>Mike</w:t>
-            </w:r>
-          </w:p>
-        </w:tc>
-        <w:tc>
-          <w:tcPr>
-            <w:tcW w:w="1525" w:type="dxa"/>
-          </w:tcPr>
-          <w:p>
-            <w:pPr>
-              <w:spacing w:after="0" w:line="240" w:lineRule="auto"/>
-              <w:jc w:val="center"/>
-              <w:rPr>
-                <w:rFonts w:ascii="Calibri" w:eastAsia="Times New Roman" w:hAnsi="Calibri" w:cs="Calibri"/>
-                <w:color w:val="000000"/>
-                <w:kern w:val="0"/>
-                <w14:ligatures w14:val="none"/>
-              </w:rPr>
-            </w:pPr>
-            <w:r>
-              <w:rPr>
-                <w:rFonts w:ascii="Calibri" w:eastAsia="Times New Roman" w:hAnsi="Calibri" w:cs="Calibri"/>
-                <w:color w:val="000000"/>
-                <w:kern w:val="0"/>
-                <w14:ligatures w14:val="none"/>
-              </w:rPr>
-              <w:t>TBD</w:t>
-            </w:r>
-          </w:p>
-        </w:tc>
-      </w:tr>
-      <w:tr>
-        <w:trPr>
-          <w:trHeight w:val="300"/>
-        </w:trPr>
-        <w:tc>
-          <w:tcPr>
-            <w:tcW w:w="625" w:type="dxa"/>
-            <w:vAlign w:val="center"/>
-            <w:hideMark/>
-          </w:tcPr>
-          <w:p>
-            <w:pPr>
-              <w:spacing w:after="0" w:line="240" w:lineRule="auto"/>
-              <w:jc w:val="center"/>
-              <w:rPr>
-                <w:rFonts w:ascii="Calibri" w:eastAsia="Times New Roman" w:hAnsi="Calibri" w:cs="Calibri"/>
-                <w:color w:val="000000"/>
-                <w:kern w:val="0"/>
-                <w14:ligatures w14:val="none"/>
-              </w:rPr>
-            </w:pPr>
-            <w:r>
-              <w:rPr>
-                <w:rFonts w:ascii="Calibri" w:eastAsia="Times New Roman" w:hAnsi="Calibri" w:cs="Calibri"/>
-                <w:color w:val="000000"/>
-                <w:kern w:val="0"/>
-                <w14:ligatures w14:val="none"/>
-              </w:rPr>
-              <w:t>6</w:t>
-            </w:r>
-          </w:p>
-        </w:tc>
-        <w:tc>
-          <w:tcPr>
-            <w:tcW w:w="1435" w:type="dxa"/>
-            <w:vAlign w:val="center"/>
-            <w:hideMark/>
-          </w:tcPr>
-          <w:p>
-            <w:pPr>
-              <w:spacing w:after="0" w:line="240" w:lineRule="auto"/>
-              <w:rPr>
-                <w:rFonts w:ascii="Calibri" w:eastAsia="Times New Roman" w:hAnsi="Calibri" w:cs="Calibri"/>
-                <w:color w:val="000000"/>
-                <w:kern w:val="0"/>
-                <w14:ligatures w14:val="none"/>
-              </w:rPr>
-            </w:pPr>
-            <w:r>
-              <w:rPr>
-                <w:rFonts w:ascii="Calibri" w:eastAsia="Times New Roman" w:hAnsi="Calibri" w:cs="Calibri"/>
-                <w:color w:val="000000"/>
-                <w:kern w:val="0"/>
-                <w14:ligatures w14:val="none"/>
-              </w:rPr>
-              <w:t>Hutter</w:t>
-            </w:r>
-          </w:p>
-        </w:tc>
-        <w:tc>
-          <w:tcPr>
-            <w:tcW w:w="1360" w:type="dxa"/>
-            <w:vAlign w:val="center"/>
-            <w:hideMark/>
-          </w:tcPr>
-          <w:p>
-            <w:pPr>
-              <w:spacing w:after="0" w:line="240" w:lineRule="auto"/>
-              <w:rPr>
-                <w:rFonts w:ascii="Calibri" w:eastAsia="Times New Roman" w:hAnsi="Calibri" w:cs="Calibri"/>
-                <w:color w:val="000000"/>
-                <w:kern w:val="0"/>
-                <w14:ligatures w14:val="none"/>
-              </w:rPr>
-            </w:pPr>
-            <w:r>
-              <w:rPr>
-                <w:rFonts w:ascii="Calibri" w:eastAsia="Times New Roman" w:hAnsi="Calibri" w:cs="Calibri"/>
-                <w:color w:val="000000"/>
-                <w:kern w:val="0"/>
-                <w14:ligatures w14:val="none"/>
-              </w:rPr>
-              <w:t>Mark</w:t>
-            </w:r>
-          </w:p>
-        </w:tc>
-        <w:tc>
-          <w:tcPr>
-            <w:tcW w:w="1525" w:type="dxa"/>
-          </w:tcPr>
-          <w:p>
-            <w:pPr>
-              <w:spacing w:after="0" w:line="240" w:lineRule="auto"/>
-              <w:jc w:val="center"/>
-              <w:rPr>
-                <w:rFonts w:ascii="Calibri" w:eastAsia="Times New Roman" w:hAnsi="Calibri" w:cs="Calibri"/>
-                <w:color w:val="000000"/>
-                <w:kern w:val="0"/>
-                <w14:ligatures w14:val="none"/>
-              </w:rPr>
-            </w:pPr>
-            <w:r>
-              <w:rPr>
-                <w:rFonts w:ascii="Calibri" w:eastAsia="Times New Roman" w:hAnsi="Calibri" w:cs="Calibri"/>
-                <w:color w:val="000000"/>
-                <w:kern w:val="0"/>
-                <w14:ligatures w14:val="none"/>
-              </w:rPr>
-              <w:t>TBD</w:t>
-            </w:r>
-          </w:p>
-        </w:tc>
-      </w:tr>
-      <w:tr>
-        <w:trPr>
-          <w:trHeight w:val="300"/>
-        </w:trPr>
-        <w:tc>
-          <w:tcPr>
-            <w:tcW w:w="625" w:type="dxa"/>
-            <w:vAlign w:val="center"/>
-          </w:tcPr>
-          <w:p>
-            <w:pPr>
-              <w:spacing w:after="0" w:line="240" w:lineRule="auto"/>
-              <w:jc w:val="center"/>
-              <w:rPr>
-                <w:rFonts w:ascii="Calibri" w:eastAsia="Times New Roman" w:hAnsi="Calibri" w:cs="Calibri"/>
-                <w:color w:val="000000"/>
-                <w:kern w:val="0"/>
-                <w14:ligatures w14:val="none"/>
-              </w:rPr>
-            </w:pPr>
-            <w:r>
-              <w:rPr>
-                <w:rFonts w:ascii="Calibri" w:eastAsia="Times New Roman" w:hAnsi="Calibri" w:cs="Calibri"/>
-                <w:color w:val="000000"/>
-                <w:kern w:val="0"/>
-                <w14:ligatures w14:val="none"/>
-              </w:rPr>
-              <w:t>7</w:t>
-            </w:r>
-          </w:p>
-        </w:tc>
-        <w:tc>
-          <w:tcPr>
-            <w:tcW w:w="1435" w:type="dxa"/>
-            <w:vAlign w:val="center"/>
-          </w:tcPr>
-          <w:p>
-            <w:pPr>
-              <w:spacing w:after="0" w:line="240" w:lineRule="auto"/>
-              <w:rPr>
-                <w:rFonts w:ascii="Calibri" w:eastAsia="Times New Roman" w:hAnsi="Calibri" w:cs="Calibri"/>
-                <w:color w:val="000000"/>
-                <w:kern w:val="0"/>
-                <w14:ligatures w14:val="none"/>
-              </w:rPr>
-            </w:pPr>
-            <w:r>
-              <w:rPr>
-                <w:rFonts w:ascii="Calibri" w:eastAsia="Times New Roman" w:hAnsi="Calibri" w:cs="Calibri"/>
-                <w:color w:val="000000"/>
-                <w:kern w:val="0"/>
-                <w14:ligatures w14:val="none"/>
-              </w:rPr>
-              <w:t>Ige</w:t>
-            </w:r>
-          </w:p>
-        </w:tc>
-        <w:tc>
-          <w:tcPr>
-            <w:tcW w:w="1360" w:type="dxa"/>
-            <w:vAlign w:val="center"/>
-          </w:tcPr>
-          <w:p>
-            <w:pPr>
-              <w:spacing w:after="0" w:line="240" w:lineRule="auto"/>
-              <w:rPr>
-                <w:rFonts w:ascii="Calibri" w:eastAsia="Times New Roman" w:hAnsi="Calibri" w:cs="Calibri"/>
-                <w:color w:val="000000"/>
-                <w:kern w:val="0"/>
-                <w14:ligatures w14:val="none"/>
-              </w:rPr>
-            </w:pPr>
-            <w:r>
-              <w:rPr>
-                <w:rFonts w:ascii="Calibri" w:eastAsia="Times New Roman" w:hAnsi="Calibri" w:cs="Calibri"/>
-                <w:color w:val="000000"/>
-                <w:kern w:val="0"/>
-                <w14:ligatures w14:val="none"/>
-              </w:rPr>
-              <w:t>Shayne</w:t>
-            </w:r>
-          </w:p>
-        </w:tc>
-        <w:tc>
-          <w:tcPr>
-            <w:tcW w:w="1525" w:type="dxa"/>
-          </w:tcPr>
-          <w:p>
-            <w:pPr>
-              <w:spacing w:after="0" w:line="240" w:lineRule="auto"/>
-              <w:jc w:val="center"/>
-              <w:rPr>
-                <w:rFonts w:ascii="Calibri" w:eastAsia="Times New Roman" w:hAnsi="Calibri" w:cs="Calibri"/>
-                <w:color w:val="000000"/>
-                <w:kern w:val="0"/>
-                <w14:ligatures w14:val="none"/>
-              </w:rPr>
-            </w:pPr>
-            <w:r>
-              <w:rPr>
-                <w:rFonts w:ascii="Calibri" w:eastAsia="Times New Roman" w:hAnsi="Calibri" w:cs="Calibri"/>
-                <w:color w:val="000000"/>
-                <w:kern w:val="0"/>
-                <w14:ligatures w14:val="none"/>
-              </w:rPr>
-              <w:t>TBD</w:t>
-            </w:r>
-          </w:p>
-        </w:tc>
-      </w:tr>
-      <w:tr>
-        <w:trPr>
-          <w:trHeight w:val="300"/>
-        </w:trPr>
-        <w:tc>
-          <w:tcPr>
-            <w:tcW w:w="625" w:type="dxa"/>
-            <w:vAlign w:val="center"/>
-          </w:tcPr>
-          <w:p>
-            <w:pPr>
-              <w:spacing w:after="0" w:line="240" w:lineRule="auto"/>
-              <w:jc w:val="center"/>
-              <w:rPr>
-                <w:rFonts w:ascii="Calibri" w:eastAsia="Times New Roman" w:hAnsi="Calibri" w:cs="Calibri"/>
-                <w:color w:val="000000"/>
-                <w:kern w:val="0"/>
-                <w14:ligatures w14:val="none"/>
-              </w:rPr>
-            </w:pPr>
-            <w:r>
-              <w:rPr>
-                <w:rFonts w:ascii="Calibri" w:eastAsia="Times New Roman" w:hAnsi="Calibri" w:cs="Calibri"/>
-                <w:color w:val="000000"/>
-                <w:kern w:val="0"/>
-                <w14:ligatures w14:val="none"/>
-              </w:rPr>
-              <w:t>8</w:t>
-            </w:r>
-          </w:p>
-        </w:tc>
-        <w:tc>
-          <w:tcPr>
-            <w:tcW w:w="1435" w:type="dxa"/>
-            <w:vAlign w:val="center"/>
-          </w:tcPr>
-          <w:p>
-            <w:pPr>
-              <w:spacing w:after="0" w:line="240" w:lineRule="auto"/>
-              <w:rPr>
-                <w:rFonts w:ascii="Calibri" w:eastAsia="Times New Roman" w:hAnsi="Calibri" w:cs="Calibri"/>
-                <w:color w:val="000000"/>
-                <w:kern w:val="0"/>
-                <w14:ligatures w14:val="none"/>
-              </w:rPr>
-            </w:pPr>
-            <w:r>
-              <w:rPr>
-                <w:rFonts w:ascii="Calibri" w:eastAsia="Times New Roman" w:hAnsi="Calibri" w:cs="Calibri"/>
-                <w:color w:val="000000"/>
-                <w:kern w:val="0"/>
-                <w14:ligatures w14:val="none"/>
-              </w:rPr>
-              <w:t>Johnson</w:t>
-            </w:r>
-          </w:p>
-        </w:tc>
-        <w:tc>
-          <w:tcPr>
-            <w:tcW w:w="1360" w:type="dxa"/>
-            <w:vAlign w:val="center"/>
-          </w:tcPr>
-          <w:p>
-            <w:pPr>
-              <w:spacing w:after="0" w:line="240" w:lineRule="auto"/>
-              <w:rPr>
-                <w:rFonts w:ascii="Calibri" w:eastAsia="Times New Roman" w:hAnsi="Calibri" w:cs="Calibri"/>
-                <w:color w:val="000000"/>
-                <w:kern w:val="0"/>
-                <w14:ligatures w14:val="none"/>
-              </w:rPr>
-            </w:pPr>
-            <w:r>
-              <w:rPr>
-                <w:rFonts w:ascii="Calibri" w:eastAsia="Times New Roman" w:hAnsi="Calibri" w:cs="Calibri"/>
-                <w:color w:val="000000"/>
-                <w:kern w:val="0"/>
-                <w14:ligatures w14:val="none"/>
-              </w:rPr>
-              <w:t>Aaron</w:t>
-            </w:r>
-          </w:p>
-        </w:tc>
-        <w:tc>
-          <w:tcPr>
-            <w:tcW w:w="1525" w:type="dxa"/>
-          </w:tcPr>
-          <w:p>
-            <w:pPr>
-              <w:spacing w:after="0" w:line="240" w:lineRule="auto"/>
-              <w:jc w:val="center"/>
-              <w:rPr>
-                <w:rFonts w:ascii="Calibri" w:eastAsia="Times New Roman" w:hAnsi="Calibri" w:cs="Calibri"/>
-                <w:color w:val="000000"/>
-                <w:kern w:val="0"/>
-                <w14:ligatures w14:val="none"/>
-              </w:rPr>
-            </w:pPr>
-            <w:r>
-              <w:rPr>
-                <w:rFonts w:ascii="Calibri" w:eastAsia="Times New Roman" w:hAnsi="Calibri" w:cs="Calibri"/>
-                <w:color w:val="000000"/>
-                <w:kern w:val="0"/>
-                <w14:ligatures w14:val="none"/>
-              </w:rPr>
-              <w:t>TBD</w:t>
-            </w:r>
-          </w:p>
-        </w:tc>
-      </w:tr>
-      <w:tr>
-        <w:trPr>
-          <w:trHeight w:val="300"/>
-        </w:trPr>
-        <w:tc>
-          <w:tcPr>
-            <w:tcW w:w="625" w:type="dxa"/>
-            <w:vAlign w:val="center"/>
-            <w:hideMark/>
-          </w:tcPr>
-          <w:p>
-            <w:pPr>
-              <w:spacing w:after="0" w:line="240" w:lineRule="auto"/>
-              <w:jc w:val="center"/>
-              <w:rPr>
-                <w:rFonts w:ascii="Calibri" w:eastAsia="Times New Roman" w:hAnsi="Calibri" w:cs="Calibri"/>
-                <w:color w:val="000000"/>
-                <w:kern w:val="0"/>
-                <w14:ligatures w14:val="none"/>
-              </w:rPr>
-            </w:pPr>
-            <w:r>
-              <w:rPr>
-                <w:rFonts w:ascii="Calibri" w:eastAsia="Times New Roman" w:hAnsi="Calibri" w:cs="Calibri"/>
-                <w:color w:val="000000"/>
-                <w:kern w:val="0"/>
-                <w14:ligatures w14:val="none"/>
-              </w:rPr>
-              <w:t>9</w:t>
-            </w:r>
-          </w:p>
-        </w:tc>
-        <w:tc>
-          <w:tcPr>
-            <w:tcW w:w="1435" w:type="dxa"/>
-            <w:vAlign w:val="center"/>
-            <w:hideMark/>
-          </w:tcPr>
-          <w:p>
-            <w:pPr>
-              <w:spacing w:after="0" w:line="240" w:lineRule="auto"/>
-              <w:rPr>
-                <w:rFonts w:ascii="Calibri" w:eastAsia="Times New Roman" w:hAnsi="Calibri" w:cs="Calibri"/>
-                <w:color w:val="000000"/>
-                <w:kern w:val="0"/>
-                <w14:ligatures w14:val="none"/>
-              </w:rPr>
-            </w:pPr>
-            <w:r>
-              <w:rPr>
-                <w:rFonts w:ascii="Calibri" w:eastAsia="Times New Roman" w:hAnsi="Calibri" w:cs="Calibri"/>
-                <w:color w:val="000000"/>
-                <w:kern w:val="0"/>
-                <w14:ligatures w14:val="none"/>
-              </w:rPr>
-              <w:t>Miller</w:t>
-            </w:r>
-          </w:p>
-        </w:tc>
-        <w:tc>
-          <w:tcPr>
-            <w:tcW w:w="1360" w:type="dxa"/>
-            <w:vAlign w:val="center"/>
-            <w:hideMark/>
-          </w:tcPr>
-          <w:p>
-            <w:pPr>
-              <w:spacing w:after="0" w:line="240" w:lineRule="auto"/>
-              <w:rPr>
-                <w:rFonts w:ascii="Calibri" w:eastAsia="Times New Roman" w:hAnsi="Calibri" w:cs="Calibri"/>
-                <w:color w:val="000000"/>
-                <w:kern w:val="0"/>
-                <w14:ligatures w14:val="none"/>
-              </w:rPr>
-            </w:pPr>
-            <w:r>
-              <w:rPr>
-                <w:rFonts w:ascii="Calibri" w:eastAsia="Times New Roman" w:hAnsi="Calibri" w:cs="Calibri"/>
-                <w:color w:val="000000"/>
-                <w:kern w:val="0"/>
-                <w14:ligatures w14:val="none"/>
-              </w:rPr>
-              <w:t>Ryan</w:t>
-            </w:r>
-          </w:p>
-        </w:tc>
-        <w:tc>
-          <w:tcPr>
-            <w:tcW w:w="1525" w:type="dxa"/>
-          </w:tcPr>
-          <w:p>
-            <w:pPr>
-              <w:spacing w:after="0" w:line="240" w:lineRule="auto"/>
-              <w:jc w:val="center"/>
-              <w:rPr>
-                <w:rFonts w:ascii="Calibri" w:eastAsia="Times New Roman" w:hAnsi="Calibri" w:cs="Calibri"/>
-                <w:color w:val="000000"/>
-                <w:kern w:val="0"/>
-                <w14:ligatures w14:val="none"/>
-              </w:rPr>
-            </w:pPr>
-            <w:r>
-              <w:rPr>
-                <w:rFonts w:ascii="Calibri" w:eastAsia="Times New Roman" w:hAnsi="Calibri" w:cs="Calibri"/>
-                <w:color w:val="000000"/>
-                <w:kern w:val="0"/>
-                <w14:ligatures w14:val="none"/>
-              </w:rPr>
-              <w:t>TBD</w:t>
-            </w:r>
-          </w:p>
-        </w:tc>
-      </w:tr>
-      <w:tr>
-        <w:trPr>
-          <w:trHeight w:val="300"/>
-        </w:trPr>
-        <w:tc>
-          <w:tcPr>
-            <w:tcW w:w="625" w:type="dxa"/>
-            <w:vAlign w:val="center"/>
-          </w:tcPr>
-          <w:p>
-            <w:pPr>
-              <w:spacing w:after="0" w:line="240" w:lineRule="auto"/>
-              <w:jc w:val="center"/>
-              <w:rPr>
-                <w:rFonts w:ascii="Calibri" w:eastAsia="Times New Roman" w:hAnsi="Calibri" w:cs="Calibri"/>
-                <w:color w:val="000000"/>
-                <w:kern w:val="0"/>
-                <w14:ligatures w14:val="none"/>
-              </w:rPr>
-            </w:pPr>
-            <w:r>
-              <w:rPr>
-                <w:rFonts w:ascii="Calibri" w:eastAsia="Times New Roman" w:hAnsi="Calibri" w:cs="Calibri"/>
-                <w:color w:val="000000"/>
-                <w:kern w:val="0"/>
-                <w14:ligatures w14:val="none"/>
-              </w:rPr>
-              <w:t>10</w:t>
-            </w:r>
-          </w:p>
-        </w:tc>
-        <w:tc>
-          <w:tcPr>
-            <w:tcW w:w="1435" w:type="dxa"/>
-            <w:vAlign w:val="center"/>
-          </w:tcPr>
-          <w:p>
-            <w:pPr>
-              <w:spacing w:after="0" w:line="240" w:lineRule="auto"/>
-              <w:rPr>
-                <w:rFonts w:ascii="Calibri" w:eastAsia="Times New Roman" w:hAnsi="Calibri" w:cs="Calibri"/>
-                <w:color w:val="000000"/>
-                <w:kern w:val="0"/>
-                <w14:ligatures w14:val="none"/>
-              </w:rPr>
-            </w:pPr>
-            <w:r>
-              <w:rPr>
-                <w:rFonts w:ascii="Calibri" w:eastAsia="Times New Roman" w:hAnsi="Calibri" w:cs="Calibri"/>
-                <w:color w:val="000000"/>
-                <w:kern w:val="0"/>
-                <w14:ligatures w14:val="none"/>
-              </w:rPr>
-              <w:t>Morgan</w:t>
-            </w:r>
-          </w:p>
-        </w:tc>
-        <w:tc>
-          <w:tcPr>
-            <w:tcW w:w="1360" w:type="dxa"/>
-            <w:vAlign w:val="center"/>
-          </w:tcPr>
-          <w:p>
-            <w:pPr>
-              <w:spacing w:after="0" w:line="240" w:lineRule="auto"/>
-              <w:rPr>
-                <w:rFonts w:ascii="Calibri" w:eastAsia="Times New Roman" w:hAnsi="Calibri" w:cs="Calibri"/>
-                <w:color w:val="000000"/>
-                <w:kern w:val="0"/>
-                <w14:ligatures w14:val="none"/>
-              </w:rPr>
-            </w:pPr>
-            <w:r>
-              <w:rPr>
-                <w:rFonts w:ascii="Calibri" w:eastAsia="Times New Roman" w:hAnsi="Calibri" w:cs="Calibri"/>
-                <w:color w:val="000000"/>
-                <w:kern w:val="0"/>
-                <w14:ligatures w14:val="none"/>
-              </w:rPr>
-              <w:t>Luke</w:t>
-            </w:r>
-          </w:p>
-        </w:tc>
-        <w:tc>
-          <w:tcPr>
-            <w:tcW w:w="1525" w:type="dxa"/>
-          </w:tcPr>
-          <w:p>
-            <w:pPr>
-              <w:spacing w:after="0" w:line="240" w:lineRule="auto"/>
-              <w:jc w:val="center"/>
-              <w:rPr>
-                <w:rFonts w:ascii="Calibri" w:eastAsia="Times New Roman" w:hAnsi="Calibri" w:cs="Calibri"/>
-                <w:color w:val="000000"/>
-                <w:kern w:val="0"/>
-                <w14:ligatures w14:val="none"/>
-              </w:rPr>
-            </w:pPr>
-            <w:r>
-              <w:rPr>
-                <w:rFonts w:ascii="Calibri" w:eastAsia="Times New Roman" w:hAnsi="Calibri" w:cs="Calibri"/>
-                <w:color w:val="000000"/>
-                <w:kern w:val="0"/>
-                <w14:ligatures w14:val="none"/>
-              </w:rPr>
-              <w:t>TBD</w:t>
-            </w:r>
-          </w:p>
-        </w:tc>
-      </w:tr>
-      <w:tr>
-        <w:trPr>
-          <w:trHeight w:val="300"/>
-        </w:trPr>
-        <w:tc>
-          <w:tcPr>
-            <w:tcW w:w="625" w:type="dxa"/>
-            <w:vAlign w:val="center"/>
-          </w:tcPr>
-          <w:p>
-            <w:pPr>
-              <w:spacing w:after="0" w:line="240" w:lineRule="auto"/>
-              <w:jc w:val="center"/>
-              <w:rPr>
-                <w:rFonts w:ascii="Calibri" w:eastAsia="Times New Roman" w:hAnsi="Calibri" w:cs="Calibri"/>
-                <w:color w:val="000000"/>
-                <w:kern w:val="0"/>
-                <w14:ligatures w14:val="none"/>
-              </w:rPr>
-            </w:pPr>
-            <w:r>
-              <w:rPr>
-                <w:rFonts w:ascii="Calibri" w:eastAsia="Times New Roman" w:hAnsi="Calibri" w:cs="Calibri"/>
-                <w:color w:val="000000"/>
-                <w:kern w:val="0"/>
-                <w14:ligatures w14:val="none"/>
-              </w:rPr>
-              <w:t>11</w:t>
-            </w:r>
-          </w:p>
-        </w:tc>
-        <w:tc>
-          <w:tcPr>
-            <w:tcW w:w="1435" w:type="dxa"/>
-            <w:vAlign w:val="center"/>
-          </w:tcPr>
-          <w:p>
-            <w:pPr>
-              <w:spacing w:after="0" w:line="240" w:lineRule="auto"/>
-              <w:rPr>
-                <w:rFonts w:ascii="Calibri" w:eastAsia="Times New Roman" w:hAnsi="Calibri" w:cs="Calibri"/>
-                <w:color w:val="000000"/>
-                <w:kern w:val="0"/>
-                <w14:ligatures w14:val="none"/>
-              </w:rPr>
-            </w:pPr>
-            <w:r>
-              <w:rPr>
-                <w:rFonts w:ascii="Calibri" w:eastAsia="Times New Roman" w:hAnsi="Calibri" w:cs="Calibri"/>
-                <w:color w:val="000000"/>
-                <w:kern w:val="0"/>
-                <w14:ligatures w14:val="none"/>
-              </w:rPr>
-              <w:t>Shirola</w:t>
-            </w:r>
-          </w:p>
-        </w:tc>
-        <w:tc>
-          <w:tcPr>
-            <w:tcW w:w="1360" w:type="dxa"/>
-            <w:vAlign w:val="center"/>
-          </w:tcPr>
-          <w:p>
-            <w:pPr>
-              <w:spacing w:after="0" w:line="240" w:lineRule="auto"/>
-              <w:rPr>
-                <w:rFonts w:ascii="Calibri" w:eastAsia="Times New Roman" w:hAnsi="Calibri" w:cs="Calibri"/>
-                <w:color w:val="000000"/>
-                <w:kern w:val="0"/>
-                <w14:ligatures w14:val="none"/>
-              </w:rPr>
-            </w:pPr>
-            <w:r>
-              <w:rPr>
-                <w:rFonts w:ascii="Calibri" w:eastAsia="Times New Roman" w:hAnsi="Calibri" w:cs="Calibri"/>
-                <w:color w:val="000000"/>
-                <w:kern w:val="0"/>
-                <w14:ligatures w14:val="none"/>
-              </w:rPr>
-              <w:t>Matthew</w:t>
-            </w:r>
-          </w:p>
-        </w:tc>
-        <w:tc>
-          <w:tcPr>
-            <w:tcW w:w="1525" w:type="dxa"/>
-          </w:tcPr>
-          <w:p>
-            <w:pPr>
-              <w:spacing w:after="0" w:line="240" w:lineRule="auto"/>
-              <w:jc w:val="center"/>
-              <w:rPr>
-                <w:rFonts w:ascii="Calibri" w:eastAsia="Times New Roman" w:hAnsi="Calibri" w:cs="Calibri"/>
-                <w:color w:val="000000"/>
-                <w:kern w:val="0"/>
-                <w14:ligatures w14:val="none"/>
-              </w:rPr>
-            </w:pPr>
-            <w:r>
-              <w:rPr>
-                <w:rFonts w:ascii="Calibri" w:eastAsia="Times New Roman" w:hAnsi="Calibri" w:cs="Calibri"/>
-                <w:color w:val="000000"/>
-                <w:kern w:val="0"/>
-                <w14:ligatures w14:val="none"/>
-              </w:rPr>
-              <w:t>TBD</w:t>
-            </w:r>
-          </w:p>
-        </w:tc>
-      </w:tr>
-      <w:tr>
-        <w:trPr>
-          <w:trHeight w:val="300"/>
-        </w:trPr>
-        <w:tc>
-          <w:tcPr>
-            <w:tcW w:w="625" w:type="dxa"/>
-            <w:vAlign w:val="center"/>
-            <w:hideMark/>
-          </w:tcPr>
-          <w:p>
-            <w:pPr>
-              <w:spacing w:after="0" w:line="240" w:lineRule="auto"/>
-              <w:jc w:val="center"/>
-              <w:rPr>
-                <w:rFonts w:ascii="Calibri" w:eastAsia="Times New Roman" w:hAnsi="Calibri" w:cs="Calibri"/>
-                <w:color w:val="000000"/>
-                <w:kern w:val="0"/>
-                <w14:ligatures w14:val="none"/>
-              </w:rPr>
-            </w:pPr>
-            <w:r>
-              <w:rPr>
-                <w:rFonts w:ascii="Calibri" w:eastAsia="Times New Roman" w:hAnsi="Calibri" w:cs="Calibri"/>
-                <w:color w:val="000000"/>
-                <w:kern w:val="0"/>
-                <w14:ligatures w14:val="none"/>
-              </w:rPr>
-              <w:t>12</w:t>
-            </w:r>
-          </w:p>
-        </w:tc>
-        <w:tc>
-          <w:tcPr>
-            <w:tcW w:w="1435" w:type="dxa"/>
-            <w:vAlign w:val="center"/>
-            <w:hideMark/>
-          </w:tcPr>
-          <w:p>
-            <w:pPr>
-              <w:spacing w:after="0" w:line="240" w:lineRule="auto"/>
-              <w:rPr>
-                <w:rFonts w:ascii="Calibri" w:eastAsia="Times New Roman" w:hAnsi="Calibri" w:cs="Calibri"/>
-                <w:color w:val="000000"/>
-                <w:kern w:val="0"/>
-                <w14:ligatures w14:val="none"/>
-              </w:rPr>
-            </w:pPr>
-            <w:r>
-              <w:rPr>
-                <w:rFonts w:ascii="Calibri" w:eastAsia="Times New Roman" w:hAnsi="Calibri" w:cs="Calibri"/>
-                <w:color w:val="000000"/>
-                <w:kern w:val="0"/>
-                <w14:ligatures w14:val="none"/>
-              </w:rPr>
-              <w:t>Vest</w:t>
-            </w:r>
-          </w:p>
-        </w:tc>
-        <w:tc>
-          <w:tcPr>
-            <w:tcW w:w="1360" w:type="dxa"/>
-            <w:vAlign w:val="center"/>
-            <w:hideMark/>
-          </w:tcPr>
-          <w:p>
-            <w:pPr>
-              <w:spacing w:after="0" w:line="240" w:lineRule="auto"/>
-              <w:rPr>
-                <w:rFonts w:ascii="Calibri" w:eastAsia="Times New Roman" w:hAnsi="Calibri" w:cs="Calibri"/>
-                <w:color w:val="000000"/>
-                <w:kern w:val="0"/>
-                <w14:ligatures w14:val="none"/>
-              </w:rPr>
-            </w:pPr>
-            <w:r>
-              <w:rPr>
-                <w:rFonts w:ascii="Calibri" w:eastAsia="Times New Roman" w:hAnsi="Calibri" w:cs="Calibri"/>
-                <w:color w:val="000000"/>
-                <w:kern w:val="0"/>
-                <w14:ligatures w14:val="none"/>
-              </w:rPr>
-              <w:t>Jeff</w:t>
-            </w:r>
-          </w:p>
-        </w:tc>
-        <w:tc>
-          <w:tcPr>
-            <w:tcW w:w="1525" w:type="dxa"/>
-          </w:tcPr>
-          <w:p>
-            <w:pPr>
-              <w:spacing w:after="0" w:line="240" w:lineRule="auto"/>
-              <w:jc w:val="center"/>
-              <w:rPr>
-                <w:rFonts w:ascii="Calibri" w:eastAsia="Times New Roman" w:hAnsi="Calibri" w:cs="Calibri"/>
-                <w:color w:val="000000"/>
-                <w:kern w:val="0"/>
-                <w14:ligatures w14:val="none"/>
-              </w:rPr>
-            </w:pPr>
-            <w:r>
-              <w:rPr>
-                <w:rFonts w:ascii="Calibri" w:eastAsia="Times New Roman" w:hAnsi="Calibri" w:cs="Calibri"/>
-                <w:color w:val="000000"/>
-                <w:kern w:val="0"/>
-                <w14:ligatures w14:val="none"/>
-              </w:rPr>
-              <w:t>TBD</w:t>
-            </w:r>
-          </w:p>
-        </w:tc>
-      </w:tr>
-      <w:tr>
-        <w:trPr>
-          <w:trHeight w:val="300"/>
-        </w:trPr>
-        <w:tc>
-          <w:tcPr>
-            <w:tcW w:w="625" w:type="dxa"/>
-            <w:vAlign w:val="center"/>
-            <w:hideMark/>
-          </w:tcPr>
-          <w:p>
-            <w:pPr>
-              <w:spacing w:after="0" w:line="240" w:lineRule="auto"/>
-              <w:jc w:val="center"/>
-              <w:rPr>
-                <w:rFonts w:ascii="Calibri" w:eastAsia="Times New Roman" w:hAnsi="Calibri" w:cs="Calibri"/>
-                <w:color w:val="000000"/>
-                <w:kern w:val="0"/>
-                <w14:ligatures w14:val="none"/>
-              </w:rPr>
-            </w:pPr>
-            <w:r>
-              <w:rPr>
-                <w:rFonts w:ascii="Calibri" w:eastAsia="Times New Roman" w:hAnsi="Calibri" w:cs="Calibri"/>
-                <w:color w:val="000000"/>
-                <w:kern w:val="0"/>
-                <w14:ligatures w14:val="none"/>
-              </w:rPr>
-              <w:t>1</w:t>
-            </w:r>
-            <w:r>
-              <w:rPr>
-                <w:rFonts w:ascii="Calibri" w:eastAsia="Times New Roman" w:hAnsi="Calibri" w:cs="Calibri"/>
-                <w:color w:val="000000"/>
-                <w:kern w:val="0"/>
-                <w14:ligatures w14:val="none"/>
-              </w:rPr>
-              <w:t>3</w:t>
-            </w:r>
-          </w:p>
-        </w:tc>
-        <w:tc>
-          <w:tcPr>
-            <w:tcW w:w="1435" w:type="dxa"/>
-            <w:vAlign w:val="center"/>
-            <w:hideMark/>
-          </w:tcPr>
-          <w:p>
-            <w:pPr>
-              <w:spacing w:after="0" w:line="240" w:lineRule="auto"/>
-              <w:rPr>
-                <w:rFonts w:ascii="Calibri" w:eastAsia="Times New Roman" w:hAnsi="Calibri" w:cs="Calibri"/>
-                <w:color w:val="000000"/>
-                <w:kern w:val="0"/>
-                <w14:ligatures w14:val="none"/>
-              </w:rPr>
-            </w:pPr>
-            <w:r>
-              <w:rPr>
-                <w:rFonts w:ascii="Calibri" w:eastAsia="Times New Roman" w:hAnsi="Calibri" w:cs="Calibri"/>
-                <w:color w:val="000000"/>
-                <w:kern w:val="0"/>
-                <w14:ligatures w14:val="none"/>
-              </w:rPr>
-              <w:t>Walters</w:t>
-            </w:r>
-          </w:p>
-        </w:tc>
-        <w:tc>
-          <w:tcPr>
-            <w:tcW w:w="1360" w:type="dxa"/>
-            <w:vAlign w:val="center"/>
-            <w:hideMark/>
-          </w:tcPr>
-          <w:p>
-            <w:pPr>
-              <w:spacing w:after="0" w:line="240" w:lineRule="auto"/>
-              <w:rPr>
-                <w:rFonts w:ascii="Calibri" w:eastAsia="Times New Roman" w:hAnsi="Calibri" w:cs="Calibri"/>
-                <w:color w:val="000000"/>
-                <w:kern w:val="0"/>
-                <w14:ligatures w14:val="none"/>
-              </w:rPr>
-            </w:pPr>
-            <w:r>
-              <w:rPr>
-                <w:rFonts w:ascii="Calibri" w:eastAsia="Times New Roman" w:hAnsi="Calibri" w:cs="Calibri"/>
-                <w:color w:val="000000"/>
-                <w:kern w:val="0"/>
-                <w14:ligatures w14:val="none"/>
-              </w:rPr>
-              <w:t>Kevin</w:t>
-            </w:r>
-          </w:p>
-        </w:tc>
-        <w:tc>
-          <w:tcPr>
-            <w:tcW w:w="1525" w:type="dxa"/>
-          </w:tcPr>
-          <w:p>
-            <w:pPr>
-              <w:spacing w:after="0" w:line="240" w:lineRule="auto"/>
-              <w:jc w:val="center"/>
-              <w:rPr>
-                <w:rFonts w:ascii="Calibri" w:eastAsia="Times New Roman" w:hAnsi="Calibri" w:cs="Calibri"/>
-                <w:color w:val="000000"/>
-                <w:kern w:val="0"/>
-                <w14:ligatures w14:val="none"/>
-              </w:rPr>
-            </w:pPr>
-            <w:r>
-              <w:rPr>
-                <w:rFonts w:ascii="Calibri" w:eastAsia="Times New Roman" w:hAnsi="Calibri" w:cs="Calibri"/>
-                <w:color w:val="000000"/>
-                <w:kern w:val="0"/>
-                <w14:ligatures w14:val="none"/>
-              </w:rPr>
-              <w:t>TBD</w:t>
-            </w:r>
-          </w:p>
-        </w:tc>
-      </w:tr>
-      <w:tr>
-        <w:trPr>
-          <w:trHeight w:val="300"/>
-        </w:trPr>
-        <w:tc>
-          <w:tcPr>
-            <w:tcW w:w="625" w:type="dxa"/>
-            <w:vAlign w:val="center"/>
-            <w:hideMark/>
-          </w:tcPr>
-          <w:p>
-            <w:pPr>
-              <w:spacing w:after="0" w:line="240" w:lineRule="auto"/>
-              <w:jc w:val="center"/>
-              <w:rPr>
-                <w:rFonts w:ascii="Calibri" w:eastAsia="Times New Roman" w:hAnsi="Calibri" w:cs="Calibri"/>
-                <w:color w:val="000000"/>
-                <w:kern w:val="0"/>
-                <w14:ligatures w14:val="none"/>
-              </w:rPr>
-            </w:pPr>
-            <w:r>
-              <w:rPr>
-                <w:rFonts w:ascii="Calibri" w:eastAsia="Times New Roman" w:hAnsi="Calibri" w:cs="Calibri"/>
-                <w:color w:val="000000"/>
-                <w:kern w:val="0"/>
-                <w14:ligatures w14:val="none"/>
-              </w:rPr>
-              <w:t>1</w:t>
-            </w:r>
-            <w:r>
-              <w:rPr>
-                <w:rFonts w:ascii="Calibri" w:eastAsia="Times New Roman" w:hAnsi="Calibri" w:cs="Calibri"/>
-                <w:color w:val="000000"/>
-                <w:kern w:val="0"/>
-                <w14:ligatures w14:val="none"/>
-              </w:rPr>
-              <w:t>4</w:t>
-            </w:r>
-          </w:p>
-        </w:tc>
-        <w:tc>
-          <w:tcPr>
-            <w:tcW w:w="1435" w:type="dxa"/>
-            <w:vAlign w:val="center"/>
-            <w:hideMark/>
-          </w:tcPr>
-          <w:p>
-            <w:pPr>
-              <w:spacing w:after="0" w:line="240" w:lineRule="auto"/>
-              <w:rPr>
-                <w:rFonts w:ascii="Calibri" w:eastAsia="Times New Roman" w:hAnsi="Calibri" w:cs="Calibri"/>
-                <w:color w:val="000000"/>
-                <w:kern w:val="0"/>
-                <w14:ligatures w14:val="none"/>
-              </w:rPr>
-            </w:pPr>
-            <w:r>
-              <w:rPr>
-                <w:rFonts w:ascii="Calibri" w:eastAsia="Times New Roman" w:hAnsi="Calibri" w:cs="Calibri"/>
-                <w:color w:val="000000"/>
-                <w:kern w:val="0"/>
-                <w14:ligatures w14:val="none"/>
-              </w:rPr>
-              <w:t>Walters</w:t>
-            </w:r>
-          </w:p>
-        </w:tc>
-        <w:tc>
-          <w:tcPr>
-            <w:tcW w:w="1360" w:type="dxa"/>
-            <w:vAlign w:val="center"/>
-            <w:hideMark/>
-          </w:tcPr>
-          <w:p>
-            <w:pPr>
-              <w:spacing w:after="0" w:line="240" w:lineRule="auto"/>
-              <w:rPr>
-                <w:rFonts w:ascii="Calibri" w:eastAsia="Times New Roman" w:hAnsi="Calibri" w:cs="Calibri"/>
-                <w:color w:val="000000"/>
-                <w:kern w:val="0"/>
-                <w14:ligatures w14:val="none"/>
-              </w:rPr>
-            </w:pPr>
-            <w:r>
-              <w:rPr>
-                <w:rFonts w:ascii="Calibri" w:eastAsia="Times New Roman" w:hAnsi="Calibri" w:cs="Calibri"/>
-                <w:color w:val="000000"/>
-                <w:kern w:val="0"/>
-                <w14:ligatures w14:val="none"/>
-              </w:rPr>
-              <w:t>Russ</w:t>
-            </w:r>
-          </w:p>
-        </w:tc>
-        <w:tc>
-          <w:tcPr>
-            <w:tcW w:w="1525" w:type="dxa"/>
-          </w:tcPr>
-          <w:p>
-            <w:pPr>
-              <w:spacing w:after="0" w:line="240" w:lineRule="auto"/>
-              <w:jc w:val="center"/>
-              <w:rPr>
-                <w:rFonts w:ascii="Calibri" w:eastAsia="Times New Roman" w:hAnsi="Calibri" w:cs="Calibri"/>
-                <w:color w:val="000000"/>
-                <w:kern w:val="0"/>
-                <w14:ligatures w14:val="none"/>
-              </w:rPr>
-            </w:pPr>
-            <w:r>
-              <w:rPr>
-                <w:rFonts w:ascii="Calibri" w:eastAsia="Times New Roman" w:hAnsi="Calibri" w:cs="Calibri"/>
-                <w:color w:val="000000"/>
-                <w:kern w:val="0"/>
-                <w14:ligatures w14:val="none"/>
-              </w:rPr>
-              <w:t>TBD</w:t>
-            </w:r>
-          </w:p>
-        </w:tc>
-      </w:tr>
-      <w:tr>
-        <w:trPr>
-          <w:trHeight w:val="300"/>
-        </w:trPr>
-        <w:tc>
-          <w:tcPr>
-            <w:tcW w:w="625" w:type="dxa"/>
-            <w:vAlign w:val="center"/>
-            <w:hideMark/>
-          </w:tcPr>
-          <w:p>
-            <w:pPr>
-              <w:spacing w:after="0" w:line="240" w:lineRule="auto"/>
-              <w:jc w:val="center"/>
-              <w:rPr>
-                <w:rFonts w:ascii="Calibri" w:eastAsia="Times New Roman" w:hAnsi="Calibri" w:cs="Calibri"/>
-                <w:color w:val="000000"/>
-                <w:kern w:val="0"/>
-                <w14:ligatures w14:val="none"/>
-              </w:rPr>
-            </w:pPr>
-            <w:r>
-              <w:rPr>
-                <w:rFonts w:ascii="Calibri" w:eastAsia="Times New Roman" w:hAnsi="Calibri" w:cs="Calibri"/>
-                <w:color w:val="000000"/>
-                <w:kern w:val="0"/>
-                <w14:ligatures w14:val="none"/>
-              </w:rPr>
-              <w:t>15</w:t>
-            </w:r>
-          </w:p>
-        </w:tc>
-        <w:tc>
-          <w:tcPr>
-            <w:tcW w:w="1435" w:type="dxa"/>
-            <w:vAlign w:val="center"/>
-            <w:hideMark/>
-          </w:tcPr>
-          <w:p>
-            <w:pPr>
-              <w:spacing w:after="0" w:line="240" w:lineRule="auto"/>
-              <w:rPr>
-                <w:rFonts w:ascii="Calibri" w:eastAsia="Times New Roman" w:hAnsi="Calibri" w:cs="Calibri"/>
-                <w:color w:val="000000"/>
-                <w:kern w:val="0"/>
-                <w14:ligatures w14:val="none"/>
-              </w:rPr>
-            </w:pPr>
-            <w:r>
-              <w:rPr>
-                <w:rFonts w:ascii="Calibri" w:eastAsia="Times New Roman" w:hAnsi="Calibri" w:cs="Calibri"/>
-                <w:color w:val="000000"/>
-                <w:kern w:val="0"/>
-                <w14:ligatures w14:val="none"/>
-              </w:rPr>
-              <w:t>White</w:t>
-            </w:r>
-          </w:p>
-        </w:tc>
-        <w:tc>
-          <w:tcPr>
-            <w:tcW w:w="1360" w:type="dxa"/>
-            <w:vAlign w:val="center"/>
-            <w:hideMark/>
-          </w:tcPr>
-          <w:p>
-            <w:pPr>
-              <w:spacing w:after="0" w:line="240" w:lineRule="auto"/>
-              <w:rPr>
-                <w:rFonts w:ascii="Calibri" w:eastAsia="Times New Roman" w:hAnsi="Calibri" w:cs="Calibri"/>
-                <w:color w:val="000000"/>
-                <w:kern w:val="0"/>
-                <w14:ligatures w14:val="none"/>
-              </w:rPr>
-            </w:pPr>
-            <w:r>
-              <w:rPr>
-                <w:rFonts w:ascii="Calibri" w:eastAsia="Times New Roman" w:hAnsi="Calibri" w:cs="Calibri"/>
-                <w:color w:val="000000"/>
-                <w:kern w:val="0"/>
-                <w14:ligatures w14:val="none"/>
-              </w:rPr>
-              <w:t>Mike</w:t>
-            </w:r>
-          </w:p>
-        </w:tc>
-        <w:tc>
-          <w:tcPr>
-            <w:tcW w:w="1525" w:type="dxa"/>
-          </w:tcPr>
-          <w:p>
-            <w:pPr>
-              <w:spacing w:after="0" w:line="240" w:lineRule="auto"/>
-              <w:jc w:val="center"/>
-              <w:rPr>
-                <w:rFonts w:ascii="Calibri" w:eastAsia="Times New Roman" w:hAnsi="Calibri" w:cs="Calibri"/>
-                <w:color w:val="000000"/>
-                <w:kern w:val="0"/>
-                <w14:ligatures w14:val="none"/>
-              </w:rPr>
-            </w:pPr>
-            <w:r>
-              <w:rPr>
-                <w:rFonts w:ascii="Calibri" w:eastAsia="Times New Roman" w:hAnsi="Calibri" w:cs="Calibri"/>
-                <w:color w:val="000000"/>
-                <w:kern w:val="0"/>
-                <w14:ligatures w14:val="none"/>
-              </w:rPr>
-              <w:t>TBD</w:t>
-            </w:r>
-          </w:p>
-        </w:tc>
-      </w:tr>
-      <w:tr>
-        <w:trPr>
-          <w:trHeight w:val="300"/>
-        </w:trPr>
-        <w:tc>
-          <w:tcPr>
-            <w:tcW w:w="625" w:type="dxa"/>
-            <w:vAlign w:val="center"/>
-            <w:hideMark/>
-          </w:tcPr>
-          <w:p>
-            <w:pPr>
-              <w:spacing w:after="0" w:line="240" w:lineRule="auto"/>
-              <w:jc w:val="center"/>
-              <w:rPr>
-                <w:rFonts w:ascii="Calibri" w:eastAsia="Times New Roman" w:hAnsi="Calibri" w:cs="Calibri"/>
-                <w:color w:val="000000"/>
-                <w:kern w:val="0"/>
-                <w14:ligatures w14:val="none"/>
-              </w:rPr>
-            </w:pPr>
-            <w:r>
-              <w:rPr>
-                <w:rFonts w:ascii="Calibri" w:eastAsia="Times New Roman" w:hAnsi="Calibri" w:cs="Calibri"/>
-                <w:color w:val="000000"/>
-                <w:kern w:val="0"/>
-                <w14:ligatures w14:val="none"/>
-              </w:rPr>
-              <w:t>16</w:t>
-            </w:r>
-          </w:p>
-        </w:tc>
-        <w:tc>
-          <w:tcPr>
-            <w:tcW w:w="1435" w:type="dxa"/>
-            <w:vAlign w:val="center"/>
-            <w:hideMark/>
-          </w:tcPr>
-          <w:p>
-            <w:pPr>
-              <w:spacing w:after="0" w:line="240" w:lineRule="auto"/>
-              <w:rPr>
-                <w:rFonts w:ascii="Calibri" w:eastAsia="Times New Roman" w:hAnsi="Calibri" w:cs="Calibri"/>
-                <w:color w:val="000000"/>
-                <w:kern w:val="0"/>
-                <w14:ligatures w14:val="none"/>
-              </w:rPr>
-            </w:pPr>
-            <w:r>
-              <w:rPr>
-                <w:rFonts w:ascii="Calibri" w:eastAsia="Times New Roman" w:hAnsi="Calibri" w:cs="Calibri"/>
-                <w:color w:val="000000"/>
-                <w:kern w:val="0"/>
-                <w14:ligatures w14:val="none"/>
-              </w:rPr>
-              <w:t>Wise</w:t>
-            </w:r>
-          </w:p>
-        </w:tc>
-        <w:tc>
-          <w:tcPr>
-            <w:tcW w:w="1360" w:type="dxa"/>
-            <w:vAlign w:val="center"/>
-            <w:hideMark/>
-          </w:tcPr>
-          <w:p>
-            <w:pPr>
-              <w:spacing w:after="0" w:line="240" w:lineRule="auto"/>
-              <w:rPr>
-                <w:rFonts w:ascii="Calibri" w:eastAsia="Times New Roman" w:hAnsi="Calibri" w:cs="Calibri"/>
-                <w:color w:val="000000"/>
-                <w:kern w:val="0"/>
-                <w14:ligatures w14:val="none"/>
-              </w:rPr>
-            </w:pPr>
-            <w:r>
-              <w:rPr>
-                <w:rFonts w:ascii="Calibri" w:eastAsia="Times New Roman" w:hAnsi="Calibri" w:cs="Calibri"/>
-                <w:color w:val="000000"/>
-                <w:kern w:val="0"/>
-                <w14:ligatures w14:val="none"/>
-              </w:rPr>
-              <w:t>Randy</w:t>
-            </w:r>
-          </w:p>
-        </w:tc>
-        <w:tc>
-          <w:tcPr>
-            <w:tcW w:w="1525" w:type="dxa"/>
-          </w:tcPr>
-          <w:p>
-            <w:pPr>
-              <w:spacing w:after="0" w:line="240" w:lineRule="auto"/>
-              <w:jc w:val="center"/>
-              <w:rPr>
-                <w:rFonts w:ascii="Calibri" w:eastAsia="Times New Roman" w:hAnsi="Calibri" w:cs="Calibri"/>
-                <w:color w:val="000000"/>
-                <w:kern w:val="0"/>
-                <w14:ligatures w14:val="none"/>
-              </w:rPr>
-            </w:pPr>
-            <w:r>
-              <w:rPr>
-                <w:rFonts w:ascii="Calibri" w:eastAsia="Times New Roman" w:hAnsi="Calibri" w:cs="Calibri"/>
-                <w:color w:val="000000"/>
-                <w:kern w:val="0"/>
-                <w14:ligatures w14:val="none"/>
-              </w:rPr>
-              <w:t>TBD</w:t>
-            </w:r>
-          </w:p>
-        </w:tc>
-      </w:tr>
-      <w:tr>
-        <w:trPr>
-          <w:trHeight w:val="300"/>
-        </w:trPr>
-        <w:tc>
-          <w:tcPr>
-            <w:tcW w:w="625" w:type="dxa"/>
-            <w:vAlign w:val="center"/>
-            <w:hideMark/>
-          </w:tcPr>
-          <w:p>
-            <w:pPr>
-              <w:spacing w:after="0" w:line="240" w:lineRule="auto"/>
-              <w:jc w:val="center"/>
-              <w:rPr>
-                <w:rFonts w:ascii="Calibri" w:eastAsia="Times New Roman" w:hAnsi="Calibri" w:cs="Calibri"/>
-                <w:color w:val="000000"/>
-                <w:kern w:val="0"/>
-                <w14:ligatures w14:val="none"/>
-              </w:rPr>
-            </w:pPr>
-            <w:r>
-              <w:rPr>
-                <w:rFonts w:ascii="Calibri" w:eastAsia="Times New Roman" w:hAnsi="Calibri" w:cs="Calibri"/>
-                <w:color w:val="000000"/>
-                <w:kern w:val="0"/>
-                <w14:ligatures w14:val="none"/>
-              </w:rPr>
-              <w:t>17</w:t>
-            </w:r>
-          </w:p>
-        </w:tc>
-        <w:tc>
-          <w:tcPr>
-            <w:tcW w:w="1435" w:type="dxa"/>
-            <w:vAlign w:val="center"/>
-            <w:hideMark/>
-          </w:tcPr>
-          <w:p>
-            <w:pPr>
-              <w:spacing w:after="0" w:line="240" w:lineRule="auto"/>
-              <w:rPr>
-                <w:rFonts w:ascii="Calibri" w:eastAsia="Times New Roman" w:hAnsi="Calibri" w:cs="Calibri"/>
-                <w:color w:val="000000"/>
-                <w:kern w:val="0"/>
-                <w14:ligatures w14:val="none"/>
-              </w:rPr>
-            </w:pPr>
-            <w:r>
-              <w:rPr>
-                <w:rFonts w:ascii="Calibri" w:eastAsia="Times New Roman" w:hAnsi="Calibri" w:cs="Calibri"/>
-                <w:color w:val="000000"/>
-                <w:kern w:val="0"/>
-                <w14:ligatures w14:val="none"/>
-              </w:rPr>
-              <w:t>Young</w:t>
-            </w:r>
-          </w:p>
-        </w:tc>
-        <w:tc>
-          <w:tcPr>
-            <w:tcW w:w="1360" w:type="dxa"/>
-            <w:vAlign w:val="center"/>
-            <w:hideMark/>
-          </w:tcPr>
-          <w:p>
-            <w:pPr>
-              <w:spacing w:after="0" w:line="240" w:lineRule="auto"/>
-              <w:rPr>
-                <w:rFonts w:ascii="Calibri" w:eastAsia="Times New Roman" w:hAnsi="Calibri" w:cs="Calibri"/>
-                <w:color w:val="000000"/>
-                <w:kern w:val="0"/>
-                <w14:ligatures w14:val="none"/>
-              </w:rPr>
-            </w:pPr>
-            <w:r>
-              <w:rPr>
-                <w:rFonts w:ascii="Calibri" w:eastAsia="Times New Roman" w:hAnsi="Calibri" w:cs="Calibri"/>
-                <w:color w:val="000000"/>
-                <w:kern w:val="0"/>
-                <w14:ligatures w14:val="none"/>
-              </w:rPr>
-              <w:t>Mark</w:t>
-            </w:r>
-          </w:p>
-        </w:tc>
-        <w:tc>
-          <w:tcPr>
-            <w:tcW w:w="1525" w:type="dxa"/>
-          </w:tcPr>
-          <w:p>
-            <w:pPr>
-              <w:spacing w:after="0" w:line="240" w:lineRule="auto"/>
-              <w:jc w:val="center"/>
-              <w:rPr>
-                <w:rFonts w:ascii="Calibri" w:eastAsia="Times New Roman" w:hAnsi="Calibri" w:cs="Calibri"/>
-                <w:color w:val="000000"/>
-                <w:kern w:val="0"/>
-                <w14:ligatures w14:val="none"/>
-              </w:rPr>
-            </w:pPr>
-            <w:r>
-              <w:rPr>
-                <w:rFonts w:ascii="Calibri" w:eastAsia="Times New Roman" w:hAnsi="Calibri" w:cs="Calibri"/>
-                <w:color w:val="000000"/>
-                <w:kern w:val="0"/>
-                <w14:ligatures w14:val="none"/>
-              </w:rPr>
-              <w:t>TBD</w:t>
-            </w:r>
-          </w:p>
-        </w:tc>
-      </w:tr>
-    </w:tbl>
-    <w:p/>
     <w:sectPr>
       <w:headerReference w:type="default" r:id="rId7"/>
       <w:pgSz w:w="12240" w:h="15840"/>
@@ -4339,7 +2278,7 @@
 </file>
 
 <file path=word/endnotes.xml><?xml version="1.0" encoding="utf-8"?>
-<w:endnotes xmlns:wpc="http://schemas.microsoft.com/office/word/2010/wordprocessingCanvas" xmlns:cx="http://schemas.microsoft.com/office/drawing/2014/chartex" xmlns:cx1="http://schemas.microsoft.com/office/drawing/2015/9/8/chartex" xmlns:cx2="http://schemas.microsoft.com/office/drawing/2015/10/21/chartex" xmlns:cx3="http://schemas.microsoft.com/office/drawing/2016/5/9/chartex" xmlns:cx4="http://schemas.microsoft.com/office/drawing/2016/5/10/chartex" xmlns:cx5="http://schemas.microsoft.com/office/drawing/2016/5/11/chartex" xmlns:cx6="http://schemas.microsoft.com/office/drawing/2016/5/12/chartex" xmlns:cx7="http://schemas.microsoft.com/office/drawing/2016/5/13/chartex" xmlns:cx8="http://schemas.microsoft.com/office/drawing/2016/5/14/chartex" xmlns:mc="http://schemas.openxmlformats.org/markup-compatibility/2006" xmlns:aink="http://schemas.microsoft.com/office/drawing/2016/ink" xmlns:am3d="http://schemas.microsoft.com/office/drawing/2017/model3d" xmlns:o="urn:schemas-microsoft-com:office:office" xmlns:oel="http://schemas.microsoft.com/office/2019/extlst" xmlns:r="http://schemas.openxmlformats.org/officeDocument/2006/relationships" xmlns:m="http://schemas.openxmlformats.org/officeDocument/2006/math" xmlns:v="urn:schemas-microsoft-com:vml" xmlns:wp14="http://schemas.microsoft.com/office/word/2010/wordprocessingDrawing" xmlns:wp="http://schemas.openxmlformats.org/drawingml/2006/wordprocessingDrawing" xmlns:w10="urn:schemas-microsoft-com:office:word" xmlns:w="http://schemas.openxmlformats.org/wordprocessingml/2006/main" xmlns:w14="http://schemas.microsoft.com/office/word/2010/wordml" xmlns:w15="http://schemas.microsoft.com/office/word/2012/wordml" xmlns:w16cex="http://schemas.microsoft.com/office/word/2018/wordml/cex" xmlns:w16cid="http://schemas.microsoft.com/office/word/2016/wordml/cid" xmlns:w16="http://schemas.microsoft.com/office/word/2018/wordml" xmlns:w16du="http://schemas.microsoft.com/office/word/2023/wordml/word16du" xmlns:w16sdtdh="http://schemas.microsoft.com/office/word/2020/wordml/sdtdatahash" xmlns:w16sdtfl="http://schemas.microsoft.com/office/word/2024/wordml/sdtformatlock" xmlns:w16se="http://schemas.microsoft.com/office/word/2015/wordml/symex" xmlns:wpg="http://schemas.microsoft.com/office/word/2010/wordprocessingGroup" xmlns:wpi="http://schemas.microsoft.com/office/word/2010/wordprocessingInk" xmlns:wne="http://schemas.microsoft.com/office/word/2006/wordml" xmlns:wps="http://schemas.microsoft.com/office/word/2010/wordprocessingShape" mc:Ignorable="w14 w15 w16se w16cid w16 w16cex w16sdtdh w16sdtfl w16du wp14">
+<w:endnotes xmlns:wpc="http://schemas.microsoft.com/office/word/2010/wordprocessingCanvas" xmlns:cx="http://schemas.microsoft.com/office/drawing/2014/chartex" xmlns:cx1="http://schemas.microsoft.com/office/drawing/2015/9/8/chartex" xmlns:cx2="http://schemas.microsoft.com/office/drawing/2015/10/21/chartex" xmlns:cx3="http://schemas.microsoft.com/office/drawing/2016/5/9/chartex" xmlns:cx4="http://schemas.microsoft.com/office/drawing/2016/5/10/chartex" xmlns:cx5="http://schemas.microsoft.com/office/drawing/2016/5/11/chartex" xmlns:cx6="http://schemas.microsoft.com/office/drawing/2016/5/12/chartex" xmlns:cx7="http://schemas.microsoft.com/office/drawing/2016/5/13/chartex" xmlns:cx8="http://schemas.microsoft.com/office/drawing/2016/5/14/chartex" xmlns:mc="http://schemas.openxmlformats.org/markup-compatibility/2006" xmlns:m="http://schemas.openxmlformats.org/officeDocument/2006/math" xmlns:aink="http://schemas.microsoft.com/office/drawing/2016/ink" xmlns:am3d="http://schemas.microsoft.com/office/drawing/2017/model3d" xmlns:oel="http://schemas.microsoft.com/office/2019/extlst" xmlns:r="http://schemas.openxmlformats.org/officeDocument/2006/relationships" xmlns:wp14="http://schemas.microsoft.com/office/word/2010/wordprocessingDrawing" xmlns:wp="http://schemas.openxmlformats.org/drawingml/2006/wordprocessingDrawing" xmlns:wpg="http://schemas.microsoft.com/office/word/2010/wordprocessingGroup" xmlns:wpi="http://schemas.microsoft.com/office/word/2010/wordprocessingInk" xmlns:wps="http://schemas.microsoft.com/office/word/2010/wordprocessingShape" xmlns:o="urn:schemas-microsoft-com:office:office" xmlns:v="urn:schemas-microsoft-com:vml" xmlns:w10="urn:schemas-microsoft-com:office:word" xmlns:w="http://schemas.openxmlformats.org/wordprocessingml/2006/main" xmlns:w14="http://schemas.microsoft.com/office/word/2010/wordml" xmlns:w15="http://schemas.microsoft.com/office/word/2012/wordml" xmlns:w16cex="http://schemas.microsoft.com/office/word/2018/wordml/cex" xmlns:w16cid="http://schemas.microsoft.com/office/word/2016/wordml/cid" xmlns:w16="http://schemas.microsoft.com/office/word/2018/wordml" xmlns:w16sdtdh="http://schemas.microsoft.com/office/word/2020/wordml/sdtdatahash" xmlns:w16sdtfl="http://schemas.microsoft.com/office/word/2024/wordml/sdtformatlock" xmlns:w16se="http://schemas.microsoft.com/office/word/2015/wordml/symex" xmlns:w16du="http://schemas.microsoft.com/office/word/2023/wordml/word16du" xmlns:wne="http://schemas.microsoft.com/office/word/2006/wordml" mc:Ignorable="w14 w15 w16se w16cid w16 w16cex w16sdtdh w16sdtfl w16du wp14">
   <w:endnote w:type="separator" w:id="-1">
     <w:p>
       <w:pPr>
@@ -4364,7 +2303,7 @@
 </file>
 
 <file path=word/footnotes.xml><?xml version="1.0" encoding="utf-8"?>
-<w:footnotes xmlns:wpc="http://schemas.microsoft.com/office/word/2010/wordprocessingCanvas" xmlns:cx="http://schemas.microsoft.com/office/drawing/2014/chartex" xmlns:cx1="http://schemas.microsoft.com/office/drawing/2015/9/8/chartex" xmlns:cx2="http://schemas.microsoft.com/office/drawing/2015/10/21/chartex" xmlns:cx3="http://schemas.microsoft.com/office/drawing/2016/5/9/chartex" xmlns:cx4="http://schemas.microsoft.com/office/drawing/2016/5/10/chartex" xmlns:cx5="http://schemas.microsoft.com/office/drawing/2016/5/11/chartex" xmlns:cx6="http://schemas.microsoft.com/office/drawing/2016/5/12/chartex" xmlns:cx7="http://schemas.microsoft.com/office/drawing/2016/5/13/chartex" xmlns:cx8="http://schemas.microsoft.com/office/drawing/2016/5/14/chartex" xmlns:mc="http://schemas.openxmlformats.org/markup-compatibility/2006" xmlns:aink="http://schemas.microsoft.com/office/drawing/2016/ink" xmlns:am3d="http://schemas.microsoft.com/office/drawing/2017/model3d" xmlns:o="urn:schemas-microsoft-com:office:office" xmlns:oel="http://schemas.microsoft.com/office/2019/extlst" xmlns:r="http://schemas.openxmlformats.org/officeDocument/2006/relationships" xmlns:m="http://schemas.openxmlformats.org/officeDocument/2006/math" xmlns:v="urn:schemas-microsoft-com:vml" xmlns:wp14="http://schemas.microsoft.com/office/word/2010/wordprocessingDrawing" xmlns:wp="http://schemas.openxmlformats.org/drawingml/2006/wordprocessingDrawing" xmlns:w10="urn:schemas-microsoft-com:office:word" xmlns:w="http://schemas.openxmlformats.org/wordprocessingml/2006/main" xmlns:w14="http://schemas.microsoft.com/office/word/2010/wordml" xmlns:w15="http://schemas.microsoft.com/office/word/2012/wordml" xmlns:w16cex="http://schemas.microsoft.com/office/word/2018/wordml/cex" xmlns:w16cid="http://schemas.microsoft.com/office/word/2016/wordml/cid" xmlns:w16="http://schemas.microsoft.com/office/word/2018/wordml" xmlns:w16du="http://schemas.microsoft.com/office/word/2023/wordml/word16du" xmlns:w16sdtdh="http://schemas.microsoft.com/office/word/2020/wordml/sdtdatahash" xmlns:w16sdtfl="http://schemas.microsoft.com/office/word/2024/wordml/sdtformatlock" xmlns:w16se="http://schemas.microsoft.com/office/word/2015/wordml/symex" xmlns:wpg="http://schemas.microsoft.com/office/word/2010/wordprocessingGroup" xmlns:wpi="http://schemas.microsoft.com/office/word/2010/wordprocessingInk" xmlns:wne="http://schemas.microsoft.com/office/word/2006/wordml" xmlns:wps="http://schemas.microsoft.com/office/word/2010/wordprocessingShape" mc:Ignorable="w14 w15 w16se w16cid w16 w16cex w16sdtdh w16sdtfl w16du wp14">
+<w:footnotes xmlns:wpc="http://schemas.microsoft.com/office/word/2010/wordprocessingCanvas" xmlns:cx="http://schemas.microsoft.com/office/drawing/2014/chartex" xmlns:cx1="http://schemas.microsoft.com/office/drawing/2015/9/8/chartex" xmlns:cx2="http://schemas.microsoft.com/office/drawing/2015/10/21/chartex" xmlns:cx3="http://schemas.microsoft.com/office/drawing/2016/5/9/chartex" xmlns:cx4="http://schemas.microsoft.com/office/drawing/2016/5/10/chartex" xmlns:cx5="http://schemas.microsoft.com/office/drawing/2016/5/11/chartex" xmlns:cx6="http://schemas.microsoft.com/office/drawing/2016/5/12/chartex" xmlns:cx7="http://schemas.microsoft.com/office/drawing/2016/5/13/chartex" xmlns:cx8="http://schemas.microsoft.com/office/drawing/2016/5/14/chartex" xmlns:mc="http://schemas.openxmlformats.org/markup-compatibility/2006" xmlns:m="http://schemas.openxmlformats.org/officeDocument/2006/math" xmlns:aink="http://schemas.microsoft.com/office/drawing/2016/ink" xmlns:am3d="http://schemas.microsoft.com/office/drawing/2017/model3d" xmlns:oel="http://schemas.microsoft.com/office/2019/extlst" xmlns:r="http://schemas.openxmlformats.org/officeDocument/2006/relationships" xmlns:wp14="http://schemas.microsoft.com/office/word/2010/wordprocessingDrawing" xmlns:wp="http://schemas.openxmlformats.org/drawingml/2006/wordprocessingDrawing" xmlns:wpg="http://schemas.microsoft.com/office/word/2010/wordprocessingGroup" xmlns:wpi="http://schemas.microsoft.com/office/word/2010/wordprocessingInk" xmlns:wps="http://schemas.microsoft.com/office/word/2010/wordprocessingShape" xmlns:o="urn:schemas-microsoft-com:office:office" xmlns:v="urn:schemas-microsoft-com:vml" xmlns:w10="urn:schemas-microsoft-com:office:word" xmlns:w="http://schemas.openxmlformats.org/wordprocessingml/2006/main" xmlns:w14="http://schemas.microsoft.com/office/word/2010/wordml" xmlns:w15="http://schemas.microsoft.com/office/word/2012/wordml" xmlns:w16cex="http://schemas.microsoft.com/office/word/2018/wordml/cex" xmlns:w16cid="http://schemas.microsoft.com/office/word/2016/wordml/cid" xmlns:w16="http://schemas.microsoft.com/office/word/2018/wordml" xmlns:w16sdtdh="http://schemas.microsoft.com/office/word/2020/wordml/sdtdatahash" xmlns:w16sdtfl="http://schemas.microsoft.com/office/word/2024/wordml/sdtformatlock" xmlns:w16se="http://schemas.microsoft.com/office/word/2015/wordml/symex" xmlns:w16du="http://schemas.microsoft.com/office/word/2023/wordml/word16du" xmlns:wne="http://schemas.microsoft.com/office/word/2006/wordml" mc:Ignorable="w14 w15 w16se w16cid w16 w16cex w16sdtdh w16sdtfl w16du wp14">
   <w:footnote w:type="separator" w:id="-1">
     <w:p>
       <w:pPr>
@@ -4389,7 +2328,7 @@
 </file>
 
 <file path=word/header1.xml><?xml version="1.0" encoding="utf-8"?>
-<w:hdr xmlns:wpc="http://schemas.microsoft.com/office/word/2010/wordprocessingCanvas" xmlns:cx="http://schemas.microsoft.com/office/drawing/2014/chartex" xmlns:cx1="http://schemas.microsoft.com/office/drawing/2015/9/8/chartex" xmlns:cx2="http://schemas.microsoft.com/office/drawing/2015/10/21/chartex" xmlns:cx3="http://schemas.microsoft.com/office/drawing/2016/5/9/chartex" xmlns:cx4="http://schemas.microsoft.com/office/drawing/2016/5/10/chartex" xmlns:cx5="http://schemas.microsoft.com/office/drawing/2016/5/11/chartex" xmlns:cx6="http://schemas.microsoft.com/office/drawing/2016/5/12/chartex" xmlns:cx7="http://schemas.microsoft.com/office/drawing/2016/5/13/chartex" xmlns:cx8="http://schemas.microsoft.com/office/drawing/2016/5/14/chartex" xmlns:mc="http://schemas.openxmlformats.org/markup-compatibility/2006" xmlns:aink="http://schemas.microsoft.com/office/drawing/2016/ink" xmlns:am3d="http://schemas.microsoft.com/office/drawing/2017/model3d" xmlns:o="urn:schemas-microsoft-com:office:office" xmlns:oel="http://schemas.microsoft.com/office/2019/extlst" xmlns:r="http://schemas.openxmlformats.org/officeDocument/2006/relationships" xmlns:m="http://schemas.openxmlformats.org/officeDocument/2006/math" xmlns:v="urn:schemas-microsoft-com:vml" xmlns:wp14="http://schemas.microsoft.com/office/word/2010/wordprocessingDrawing" xmlns:wp="http://schemas.openxmlformats.org/drawingml/2006/wordprocessingDrawing" xmlns:w10="urn:schemas-microsoft-com:office:word" xmlns:w="http://schemas.openxmlformats.org/wordprocessingml/2006/main" xmlns:w14="http://schemas.microsoft.com/office/word/2010/wordml" xmlns:w15="http://schemas.microsoft.com/office/word/2012/wordml" xmlns:w16cex="http://schemas.microsoft.com/office/word/2018/wordml/cex" xmlns:w16cid="http://schemas.microsoft.com/office/word/2016/wordml/cid" xmlns:w16="http://schemas.microsoft.com/office/word/2018/wordml" xmlns:w16du="http://schemas.microsoft.com/office/word/2023/wordml/word16du" xmlns:w16sdtdh="http://schemas.microsoft.com/office/word/2020/wordml/sdtdatahash" xmlns:w16sdtfl="http://schemas.microsoft.com/office/word/2024/wordml/sdtformatlock" xmlns:w16se="http://schemas.microsoft.com/office/word/2015/wordml/symex" xmlns:wpg="http://schemas.microsoft.com/office/word/2010/wordprocessingGroup" xmlns:wpi="http://schemas.microsoft.com/office/word/2010/wordprocessingInk" xmlns:wne="http://schemas.microsoft.com/office/word/2006/wordml" xmlns:wps="http://schemas.microsoft.com/office/word/2010/wordprocessingShape" mc:Ignorable="w14 w15 w16se w16cid w16 w16cex w16sdtdh w16sdtfl w16du wp14">
+<w:hdr xmlns:wpc="http://schemas.microsoft.com/office/word/2010/wordprocessingCanvas" xmlns:cx="http://schemas.microsoft.com/office/drawing/2014/chartex" xmlns:cx1="http://schemas.microsoft.com/office/drawing/2015/9/8/chartex" xmlns:cx2="http://schemas.microsoft.com/office/drawing/2015/10/21/chartex" xmlns:cx3="http://schemas.microsoft.com/office/drawing/2016/5/9/chartex" xmlns:cx4="http://schemas.microsoft.com/office/drawing/2016/5/10/chartex" xmlns:cx5="http://schemas.microsoft.com/office/drawing/2016/5/11/chartex" xmlns:cx6="http://schemas.microsoft.com/office/drawing/2016/5/12/chartex" xmlns:cx7="http://schemas.microsoft.com/office/drawing/2016/5/13/chartex" xmlns:cx8="http://schemas.microsoft.com/office/drawing/2016/5/14/chartex" xmlns:mc="http://schemas.openxmlformats.org/markup-compatibility/2006" xmlns:m="http://schemas.openxmlformats.org/officeDocument/2006/math" xmlns:aink="http://schemas.microsoft.com/office/drawing/2016/ink" xmlns:am3d="http://schemas.microsoft.com/office/drawing/2017/model3d" xmlns:oel="http://schemas.microsoft.com/office/2019/extlst" xmlns:r="http://schemas.openxmlformats.org/officeDocument/2006/relationships" xmlns:wp14="http://schemas.microsoft.com/office/word/2010/wordprocessingDrawing" xmlns:wp="http://schemas.openxmlformats.org/drawingml/2006/wordprocessingDrawing" xmlns:wpg="http://schemas.microsoft.com/office/word/2010/wordprocessingGroup" xmlns:wpi="http://schemas.microsoft.com/office/word/2010/wordprocessingInk" xmlns:wps="http://schemas.microsoft.com/office/word/2010/wordprocessingShape" xmlns:o="urn:schemas-microsoft-com:office:office" xmlns:v="urn:schemas-microsoft-com:vml" xmlns:w10="urn:schemas-microsoft-com:office:word" xmlns:w="http://schemas.openxmlformats.org/wordprocessingml/2006/main" xmlns:w14="http://schemas.microsoft.com/office/word/2010/wordml" xmlns:w15="http://schemas.microsoft.com/office/word/2012/wordml" xmlns:w16cex="http://schemas.microsoft.com/office/word/2018/wordml/cex" xmlns:w16cid="http://schemas.microsoft.com/office/word/2016/wordml/cid" xmlns:w16="http://schemas.microsoft.com/office/word/2018/wordml" xmlns:w16sdtdh="http://schemas.microsoft.com/office/word/2020/wordml/sdtdatahash" xmlns:w16sdtfl="http://schemas.microsoft.com/office/word/2024/wordml/sdtformatlock" xmlns:w16se="http://schemas.microsoft.com/office/word/2015/wordml/symex" xmlns:w16du="http://schemas.microsoft.com/office/word/2023/wordml/word16du" xmlns:wne="http://schemas.microsoft.com/office/word/2006/wordml" mc:Ignorable="w14 w15 w16se w16cid w16 w16cex w16sdtdh w16sdtfl w16du wp14">
   <w:p>
     <w:pPr>
       <w:pStyle w:val="Header"/>
@@ -4647,7 +2586,7 @@
 </file>
 
 <file path=word/numbering.xml><?xml version="1.0" encoding="utf-8"?>
-<w:numbering xmlns:wpc="http://schemas.microsoft.com/office/word/2010/wordprocessingCanvas" xmlns:cx="http://schemas.microsoft.com/office/drawing/2014/chartex" xmlns:cx1="http://schemas.microsoft.com/office/drawing/2015/9/8/chartex" xmlns:cx2="http://schemas.microsoft.com/office/drawing/2015/10/21/chartex" xmlns:cx3="http://schemas.microsoft.com/office/drawing/2016/5/9/chartex" xmlns:cx4="http://schemas.microsoft.com/office/drawing/2016/5/10/chartex" xmlns:cx5="http://schemas.microsoft.com/office/drawing/2016/5/11/chartex" xmlns:cx6="http://schemas.microsoft.com/office/drawing/2016/5/12/chartex" xmlns:cx7="http://schemas.microsoft.com/office/drawing/2016/5/13/chartex" xmlns:cx8="http://schemas.microsoft.com/office/drawing/2016/5/14/chartex" xmlns:mc="http://schemas.openxmlformats.org/markup-compatibility/2006" xmlns:aink="http://schemas.microsoft.com/office/drawing/2016/ink" xmlns:am3d="http://schemas.microsoft.com/office/drawing/2017/model3d" xmlns:o="urn:schemas-microsoft-com:office:office" xmlns:oel="http://schemas.microsoft.com/office/2019/extlst" xmlns:r="http://schemas.openxmlformats.org/officeDocument/2006/relationships" xmlns:m="http://schemas.openxmlformats.org/officeDocument/2006/math" xmlns:v="urn:schemas-microsoft-com:vml" xmlns:wp14="http://schemas.microsoft.com/office/word/2010/wordprocessingDrawing" xmlns:wp="http://schemas.openxmlformats.org/drawingml/2006/wordprocessingDrawing" xmlns:w10="urn:schemas-microsoft-com:office:word" xmlns:w="http://schemas.openxmlformats.org/wordprocessingml/2006/main" xmlns:w14="http://schemas.microsoft.com/office/word/2010/wordml" xmlns:w15="http://schemas.microsoft.com/office/word/2012/wordml" xmlns:w16cex="http://schemas.microsoft.com/office/word/2018/wordml/cex" xmlns:w16cid="http://schemas.microsoft.com/office/word/2016/wordml/cid" xmlns:w16="http://schemas.microsoft.com/office/word/2018/wordml" xmlns:w16du="http://schemas.microsoft.com/office/word/2023/wordml/word16du" xmlns:w16sdtdh="http://schemas.microsoft.com/office/word/2020/wordml/sdtdatahash" xmlns:w16sdtfl="http://schemas.microsoft.com/office/word/2024/wordml/sdtformatlock" xmlns:w16se="http://schemas.microsoft.com/office/word/2015/wordml/symex" xmlns:wpg="http://schemas.microsoft.com/office/word/2010/wordprocessingGroup" xmlns:wpi="http://schemas.microsoft.com/office/word/2010/wordprocessingInk" xmlns:wne="http://schemas.microsoft.com/office/word/2006/wordml" xmlns:wps="http://schemas.microsoft.com/office/word/2010/wordprocessingShape" mc:Ignorable="w14 w15 w16se w16cid w16 w16cex w16sdtdh w16sdtfl w16du wp14">
+<w:numbering xmlns:wpc="http://schemas.microsoft.com/office/word/2010/wordprocessingCanvas" xmlns:cx="http://schemas.microsoft.com/office/drawing/2014/chartex" xmlns:cx1="http://schemas.microsoft.com/office/drawing/2015/9/8/chartex" xmlns:cx2="http://schemas.microsoft.com/office/drawing/2015/10/21/chartex" xmlns:cx3="http://schemas.microsoft.com/office/drawing/2016/5/9/chartex" xmlns:cx4="http://schemas.microsoft.com/office/drawing/2016/5/10/chartex" xmlns:cx5="http://schemas.microsoft.com/office/drawing/2016/5/11/chartex" xmlns:cx6="http://schemas.microsoft.com/office/drawing/2016/5/12/chartex" xmlns:cx7="http://schemas.microsoft.com/office/drawing/2016/5/13/chartex" xmlns:cx8="http://schemas.microsoft.com/office/drawing/2016/5/14/chartex" xmlns:mc="http://schemas.openxmlformats.org/markup-compatibility/2006" xmlns:m="http://schemas.openxmlformats.org/officeDocument/2006/math" xmlns:aink="http://schemas.microsoft.com/office/drawing/2016/ink" xmlns:am3d="http://schemas.microsoft.com/office/drawing/2017/model3d" xmlns:oel="http://schemas.microsoft.com/office/2019/extlst" xmlns:r="http://schemas.openxmlformats.org/officeDocument/2006/relationships" xmlns:wp14="http://schemas.microsoft.com/office/word/2010/wordprocessingDrawing" xmlns:wp="http://schemas.openxmlformats.org/drawingml/2006/wordprocessingDrawing" xmlns:wpg="http://schemas.microsoft.com/office/word/2010/wordprocessingGroup" xmlns:wpi="http://schemas.microsoft.com/office/word/2010/wordprocessingInk" xmlns:wps="http://schemas.microsoft.com/office/word/2010/wordprocessingShape" xmlns:o="urn:schemas-microsoft-com:office:office" xmlns:v="urn:schemas-microsoft-com:vml" xmlns:w10="urn:schemas-microsoft-com:office:word" xmlns:w="http://schemas.openxmlformats.org/wordprocessingml/2006/main" xmlns:w14="http://schemas.microsoft.com/office/word/2010/wordml" xmlns:w15="http://schemas.microsoft.com/office/word/2012/wordml" xmlns:w16cex="http://schemas.microsoft.com/office/word/2018/wordml/cex" xmlns:w16cid="http://schemas.microsoft.com/office/word/2016/wordml/cid" xmlns:w16="http://schemas.microsoft.com/office/word/2018/wordml" xmlns:w16sdtdh="http://schemas.microsoft.com/office/word/2020/wordml/sdtdatahash" xmlns:w16sdtfl="http://schemas.microsoft.com/office/word/2024/wordml/sdtformatlock" xmlns:w16se="http://schemas.microsoft.com/office/word/2015/wordml/symex" xmlns:w16du="http://schemas.microsoft.com/office/word/2023/wordml/word16du" xmlns:wne="http://schemas.microsoft.com/office/word/2006/wordml" mc:Ignorable="w14 w15 w16se w16cid w16 w16cex w16sdtdh w16sdtfl w16du wp14">
   <w:abstractNum w:abstractNumId="0" w15:restartNumberingAfterBreak="0">
     <w:nsid w:val="26A5413C"/>
     <w:multiLevelType w:val="hybridMultilevel"/>
@@ -4839,7 +2778,7 @@
 </file>
 
 <file path=word/styles.xml><?xml version="1.0" encoding="utf-8"?>
-<w:styles xmlns:mc="http://schemas.openxmlformats.org/markup-compatibility/2006" xmlns:r="http://schemas.openxmlformats.org/officeDocument/2006/relationships" xmlns:w="http://schemas.openxmlformats.org/wordprocessingml/2006/main" xmlns:w14="http://schemas.microsoft.com/office/word/2010/wordml" xmlns:w15="http://schemas.microsoft.com/office/word/2012/wordml" xmlns:w16cex="http://schemas.microsoft.com/office/word/2018/wordml/cex" xmlns:w16cid="http://schemas.microsoft.com/office/word/2016/wordml/cid" xmlns:w16="http://schemas.microsoft.com/office/word/2018/wordml" xmlns:w16du="http://schemas.microsoft.com/office/word/2023/wordml/word16du" xmlns:w16sdtdh="http://schemas.microsoft.com/office/word/2020/wordml/sdtdatahash" xmlns:w16sdtfl="http://schemas.microsoft.com/office/word/2024/wordml/sdtformatlock" xmlns:w16se="http://schemas.microsoft.com/office/word/2015/wordml/symex" mc:Ignorable="w14 w15 w16se w16cid w16 w16cex w16sdtdh w16sdtfl w16du">
+<w:styles xmlns:mc="http://schemas.openxmlformats.org/markup-compatibility/2006" xmlns:r="http://schemas.openxmlformats.org/officeDocument/2006/relationships" xmlns:w="http://schemas.openxmlformats.org/wordprocessingml/2006/main" xmlns:w14="http://schemas.microsoft.com/office/word/2010/wordml" xmlns:w15="http://schemas.microsoft.com/office/word/2012/wordml" xmlns:w16cex="http://schemas.microsoft.com/office/word/2018/wordml/cex" xmlns:w16cid="http://schemas.microsoft.com/office/word/2016/wordml/cid" xmlns:w16="http://schemas.microsoft.com/office/word/2018/wordml" xmlns:w16sdtdh="http://schemas.microsoft.com/office/word/2020/wordml/sdtdatahash" xmlns:w16sdtfl="http://schemas.microsoft.com/office/word/2024/wordml/sdtformatlock" xmlns:w16se="http://schemas.microsoft.com/office/word/2015/wordml/symex" xmlns:w16du="http://schemas.microsoft.com/office/word/2023/wordml/word16du" mc:Ignorable="w14 w15 w16se w16cid w16 w16cex w16sdtdh w16sdtfl w16du">
   <w:docDefaults>
     <w:rPrDefault>
       <w:rPr>

</xml_diff>